<commit_message>
Base papers sheet, rewritten synopsis objectives, leave-one-out ablation
Literature survey gets a second sheet with the 8 base papers: why each was chosen, what we take from it, what we do differently and which objective it supports. Synopsis objectives rewritten around those papers; outdated lines (Streamlit, Plotly, PCA wording) corrected. Objective 2 asks how much each descriptor adds, so the ablation now also drops one family at a time (HOG+LBP, HOG+Zernike, Zernike+LBP).
</commit_message>
<xml_diff>
--- a/docs/02_synopsis/DS_FF180_g2.docx
+++ b/docs/02_synopsis/DS_FF180_g2.docx
@@ -1,6 +1,6 @@
 
 <file path=word/document.xml><?xml version="1.0" encoding="utf-8"?>
-<w:document xmlns:wpc="http://schemas.microsoft.com/office/word/2010/wordprocessingCanvas" xmlns:mc="http://schemas.openxmlformats.org/markup-compatibility/2006" xmlns:o="urn:schemas-microsoft-com:office:office" xmlns:r="http://schemas.openxmlformats.org/officeDocument/2006/relationships" xmlns:m="http://schemas.openxmlformats.org/officeDocument/2006/math" xmlns:v="urn:schemas-microsoft-com:vml" xmlns:wp14="http://schemas.microsoft.com/office/word/2010/wordprocessingDrawing" xmlns:wp="http://schemas.openxmlformats.org/drawingml/2006/wordprocessingDrawing" xmlns:w10="urn:schemas-microsoft-com:office:word" xmlns:w="http://schemas.openxmlformats.org/wordprocessingml/2006/main" xmlns:w14="http://schemas.microsoft.com/office/word/2010/wordml" xmlns:w15="http://schemas.microsoft.com/office/word/2012/wordml" xmlns:wpg="http://schemas.microsoft.com/office/word/2010/wordprocessingGroup" xmlns:wpi="http://schemas.microsoft.com/office/word/2010/wordprocessingInk" xmlns:wne="http://schemas.microsoft.com/office/word/2006/wordml" xmlns:wps="http://schemas.microsoft.com/office/word/2010/wordprocessingShape" mc:Ignorable="w14 w15 wp14">
+<w:document xmlns:wpc="http://schemas.microsoft.com/office/word/2010/wordprocessingCanvas" xmlns:cx="http://schemas.microsoft.com/office/drawing/2014/chartex" xmlns:cx1="http://schemas.microsoft.com/office/drawing/2015/9/8/chartex" xmlns:cx2="http://schemas.microsoft.com/office/drawing/2015/10/21/chartex" xmlns:cx3="http://schemas.microsoft.com/office/drawing/2016/5/9/chartex" xmlns:cx4="http://schemas.microsoft.com/office/drawing/2016/5/10/chartex" xmlns:cx5="http://schemas.microsoft.com/office/drawing/2016/5/11/chartex" xmlns:cx6="http://schemas.microsoft.com/office/drawing/2016/5/12/chartex" xmlns:cx7="http://schemas.microsoft.com/office/drawing/2016/5/13/chartex" xmlns:cx8="http://schemas.microsoft.com/office/drawing/2016/5/14/chartex" xmlns:mc="http://schemas.openxmlformats.org/markup-compatibility/2006" xmlns:aink="http://schemas.microsoft.com/office/drawing/2016/ink" xmlns:am3d="http://schemas.microsoft.com/office/drawing/2017/model3d" xmlns:o="urn:schemas-microsoft-com:office:office" xmlns:oel="http://schemas.microsoft.com/office/2019/extlst" xmlns:r="http://schemas.openxmlformats.org/officeDocument/2006/relationships" xmlns:m="http://schemas.openxmlformats.org/officeDocument/2006/math" xmlns:v="urn:schemas-microsoft-com:vml" xmlns:wp14="http://schemas.microsoft.com/office/word/2010/wordprocessingDrawing" xmlns:wp="http://schemas.openxmlformats.org/drawingml/2006/wordprocessingDrawing" xmlns:w10="urn:schemas-microsoft-com:office:word" xmlns:w="http://schemas.openxmlformats.org/wordprocessingml/2006/main" xmlns:w14="http://schemas.microsoft.com/office/word/2010/wordml" xmlns:w15="http://schemas.microsoft.com/office/word/2012/wordml" xmlns:w16cex="http://schemas.microsoft.com/office/word/2018/wordml/cex" xmlns:w16cid="http://schemas.microsoft.com/office/word/2016/wordml/cid" xmlns:w16="http://schemas.microsoft.com/office/word/2018/wordml" xmlns:w16du="http://schemas.microsoft.com/office/word/2023/wordml/word16du" xmlns:w16sdtdh="http://schemas.microsoft.com/office/word/2020/wordml/sdtdatahash" xmlns:w16sdtfl="http://schemas.microsoft.com/office/word/2024/wordml/sdtformatlock" xmlns:w16se="http://schemas.microsoft.com/office/word/2015/wordml/symex" xmlns:wpg="http://schemas.microsoft.com/office/word/2010/wordprocessingGroup" xmlns:wpi="http://schemas.microsoft.com/office/word/2010/wordprocessingInk" xmlns:wne="http://schemas.microsoft.com/office/word/2006/wordml" xmlns:wps="http://schemas.microsoft.com/office/word/2010/wordprocessingShape" mc:Ignorable="w14 w15 w16se w16cid w16 w16cex w16sdtdh w16sdtfl w16du wp14">
   <w:body>
     <w:tbl>
       <w:tblPr>
@@ -413,7 +413,7 @@
                 <w:sz w:val="20"/>
                 <w:szCs w:val="20"/>
               </w:rPr>
-              <w:t xml:space="preserve">TY-A2</w:t>
+              <w:t>TY-A2</w:t>
             </w:r>
           </w:p>
         </w:tc>
@@ -478,7 +478,7 @@
                 <w:sz w:val="20"/>
                 <w:szCs w:val="20"/>
               </w:rPr>
-              <w:t xml:space="preserve">Explainable Feature Fusion and Ensemble Learning for Modi Script Recognition</w:t>
+              <w:t>Explainable Feature Fusion and Ensemble Learning for Modi Script Recognition</w:t>
             </w:r>
           </w:p>
         </w:tc>
@@ -816,7 +816,7 @@
                 <w:sz w:val="20"/>
                 <w:szCs w:val="20"/>
               </w:rPr>
-              <w:t xml:space="preserve">1</w:t>
+              <w:t>1</w:t>
             </w:r>
           </w:p>
           <w:p>
@@ -852,7 +852,7 @@
                 <w:sz w:val="20"/>
                 <w:szCs w:val="20"/>
               </w:rPr>
-              <w:t xml:space="preserve">CS-A</w:t>
+              <w:t>CS-A</w:t>
             </w:r>
           </w:p>
         </w:tc>
@@ -880,7 +880,7 @@
                 <w:sz w:val="20"/>
                 <w:szCs w:val="20"/>
               </w:rPr>
-              <w:t xml:space="preserve">44</w:t>
+              <w:t>44</w:t>
             </w:r>
           </w:p>
         </w:tc>
@@ -909,7 +909,7 @@
                 <w:sz w:val="20"/>
                 <w:szCs w:val="20"/>
               </w:rPr>
-              <w:t xml:space="preserve">12413412</w:t>
+              <w:t>12413412</w:t>
             </w:r>
           </w:p>
         </w:tc>
@@ -939,7 +939,7 @@
                 <w:sz w:val="20"/>
                 <w:szCs w:val="20"/>
               </w:rPr>
-              <w:t xml:space="preserve">Ananya Viraj Choudhari</w:t>
+              <w:t>Ananya Viraj Choudhari</w:t>
             </w:r>
           </w:p>
         </w:tc>
@@ -969,7 +969,7 @@
                 <w:sz w:val="20"/>
                 <w:szCs w:val="20"/>
               </w:rPr>
-              <w:t xml:space="preserve">9307971404</w:t>
+              <w:t>9307971404</w:t>
             </w:r>
           </w:p>
         </w:tc>
@@ -999,7 +999,7 @@
                 <w:sz w:val="20"/>
                 <w:szCs w:val="20"/>
               </w:rPr>
-              <w:t xml:space="preserve">viraj.ananya24@vit.edu</w:t>
+              <w:t>viraj.ananya24@vit.edu</w:t>
             </w:r>
           </w:p>
         </w:tc>
@@ -1033,7 +1033,7 @@
                 <w:sz w:val="20"/>
                 <w:szCs w:val="20"/>
               </w:rPr>
-              <w:t xml:space="preserve">2</w:t>
+              <w:t>2</w:t>
             </w:r>
           </w:p>
           <w:p>
@@ -1069,7 +1069,7 @@
                 <w:sz w:val="20"/>
                 <w:szCs w:val="20"/>
               </w:rPr>
-              <w:t xml:space="preserve">CS-A</w:t>
+              <w:t>CS-A</w:t>
             </w:r>
           </w:p>
         </w:tc>
@@ -1097,7 +1097,7 @@
                 <w:sz w:val="20"/>
                 <w:szCs w:val="20"/>
               </w:rPr>
-              <w:t xml:space="preserve">61</w:t>
+              <w:t>61</w:t>
             </w:r>
           </w:p>
         </w:tc>
@@ -1126,7 +1126,7 @@
                 <w:sz w:val="20"/>
                 <w:szCs w:val="20"/>
               </w:rPr>
-              <w:t xml:space="preserve">12414120</w:t>
+              <w:t>12414120</w:t>
             </w:r>
           </w:p>
         </w:tc>
@@ -1156,7 +1156,7 @@
                 <w:sz w:val="20"/>
                 <w:szCs w:val="20"/>
               </w:rPr>
-              <w:t xml:space="preserve">Arya Bharat Patil</w:t>
+              <w:t>Arya Bharat Patil</w:t>
             </w:r>
           </w:p>
         </w:tc>
@@ -1186,7 +1186,7 @@
                 <w:sz w:val="20"/>
                 <w:szCs w:val="20"/>
               </w:rPr>
-              <w:t xml:space="preserve">8605482342</w:t>
+              <w:t>8605482342</w:t>
             </w:r>
           </w:p>
         </w:tc>
@@ -1216,7 +1216,7 @@
                 <w:sz w:val="20"/>
                 <w:szCs w:val="20"/>
               </w:rPr>
-              <w:t xml:space="preserve">arya.patil24@vit.edu</w:t>
+              <w:t>arya.patil24@vit.edu</w:t>
             </w:r>
           </w:p>
         </w:tc>
@@ -1265,7 +1265,7 @@
                 <w:sz w:val="20"/>
                 <w:szCs w:val="20"/>
               </w:rPr>
-              <w:t xml:space="preserve">Name of Internal Guide:   Prof. Nilam Honmane</w:t>
+              <w:t>Name of Internal Guide:   Prof. Nilam Honmane</w:t>
             </w:r>
           </w:p>
           <w:p>
@@ -1441,7 +1441,7 @@
                 <w:sz w:val="20"/>
                 <w:szCs w:val="20"/>
               </w:rPr>
-              <w:t xml:space="preserve">Guide                                                  Project Coordinator                                                       Head,</w:t>
+              <w:t>Guide                                                  Project Coordinator                                                       Head,</w:t>
             </w:r>
           </w:p>
           <w:p>
@@ -1524,8 +1524,14 @@
       </w:pPr>
       <w:r>
         <w:t xml:space="preserve">                                      </w:t>
+      </w:r>
+      <w:r>
         <w:tab/>
+      </w:r>
+      <w:r>
         <w:tab/>
+      </w:r>
+      <w:r>
         <w:tab/>
         <w:t xml:space="preserve">      </w:t>
       </w:r>
@@ -1538,7 +1544,6 @@
         <w:jc w:val="both"/>
       </w:pPr>
       <w:r>
-        <w:lastRenderedPageBreak/>
         <w:t xml:space="preserve">                                                                                                                                               </w:t>
       </w:r>
       <w:r>
@@ -1636,6 +1641,7 @@
                 <w:b/>
                 <w:bCs/>
               </w:rPr>
+              <w:lastRenderedPageBreak/>
               <w:t>Introduction</w:t>
             </w:r>
           </w:p>
@@ -1653,8 +1659,7 @@
               <w:t xml:space="preserve">Explainable Feature Fusion and Ensemble Learning for Modi Script Recognition: </w:t>
             </w:r>
             <w:r>
-              <w:rPr/>
-              <w:t xml:space="preserve">is a recognition system for handwritten Modi script. Modi is the cursive script used to write Marathi for about 700 years in land records, court documents and administrative correspondence across Maharashtra. Very few people can read it today, so millions of archived documents are effectively unreadable. The system deliberately uses classical machine learning with handcrafted features instead of deep learning: three complementary descriptors, Histogram of Oriented Gradients (HOG), Zernike moments and Local Binary Patterns (LBP), are fused and classified by Random Forest, SVM (RBF), XGBoost and a stacking ensemble, and every prediction is explained with SHAP. The work is delivered as an interactive web application that recognises the characters in an uploaded image and shows why each decision was made.</w:t>
+              <w:t>is a recognition system for handwritten Modi script. Modi is the cursive script used to write Marathi for about 700 years in land records, court documents and administrative correspondence across Maharashtra. Very few people can read it today, so millions of archived documents are effectively unreadable. The system deliberately uses classical machine learning with handcrafted features instead of deep learning: three complementary descriptors, Histogram of Oriented Gradients (HOG), Zernike moments and Local Binary Patterns (LBP), are fused and classified by Random Forest, SVM (RBF), XGBoost and a stacking ensemble, and every prediction is explained with SHAP. The work is delivered as an interactive web application that recognises the characters in an uploaded image and shows why each decision was made.</w:t>
             </w:r>
           </w:p>
           <w:p>
@@ -1700,8 +1705,7 @@
               <w:jc w:val="both"/>
             </w:pPr>
             <w:r>
-              <w:rPr/>
-              <w:t xml:space="preserve">Millions of historical Modi documents cannot be read because very few experts remain who know the script. Earlier automatic recognition studies do not solve this reliably: deep-learning studies report 86-98.92% accuracy on a benchmark of only 90 images per class and show clear signs of overfitting, while classical studies report 97.77-99.3% on private datasets of undisclosed size, so their results cannot be verified. None of the surveyed studies explains its predictions or analyses which characters are confused with each other. An accurate, reproducible and explainable recognition system evaluated on a public dataset is therefore needed, together with a measurement of the training-set size at which handcrafted features stop being competitive with deep learning.</w:t>
+              <w:t>Millions of historical Modi documents cannot be read because very few experts remain who know the script. Earlier automatic recognition studies do not solve this reliably: deep-learning studies report 86-98.92% accuracy on a benchmark of only 90 images per class and show clear signs of overfitting, while classical studies report 97.77-99.3% on private datasets of undisclosed size, so their results cannot be verified. None of the surveyed studies explains its predictions or analyses which characters are confused with each other. An accurate, reproducible and explainable recognition system evaluated on a public dataset is therefore needed, together with a measurement of the training-set size at which handcrafted features stop being competitive with deep learning.</w:t>
             </w:r>
           </w:p>
           <w:p>
@@ -1764,8 +1768,7 @@
               <w:jc w:val="both"/>
             </w:pPr>
             <w:r>
-              <w:rPr/>
-              <w:t xml:space="preserve">To build a handwritten Modi character recognition system using classical machine learning with handcrafted features, without deep learning in the recognition pipeline.</w:t>
+              <w:t>To recognise all 57 handwritten Modi character classes (12 vowels, 35 consonants and 10 digits) using handcrafted features and classical machine learning instead of a deep network. Most recent papers, such as Bhong and Kulkarni (2025) and Kolte and Gupta (2025), train CNNs on about 90 images per class, and their own numbers show the models overfitting.</w:t>
             </w:r>
           </w:p>
           <w:p>
@@ -1778,8 +1781,7 @@
               <w:jc w:val="both"/>
             </w:pPr>
             <w:r>
-              <w:rPr/>
-              <w:t xml:space="preserve">To fuse three complementary descriptor families (HOG, Zernike moments and LBP) and measure the contribution of each one through an ablation study.</w:t>
+              <w:t>To combine three kinds of features, HOG for stroke direction, Zernike moments for overall shape and LBP for small local patterns, and to check through an ablation study how much each one adds. Kulkarni et al. (2014) tried Zernike moments on just 100 digit images, and Mandke et al. (2024) gave their SVM and KNN raw pixels, so a proper fused feature set has not been tried on Modi yet.</w:t>
             </w:r>
           </w:p>
           <w:p>
@@ -1792,8 +1794,7 @@
               <w:jc w:val="both"/>
             </w:pPr>
             <w:r>
-              <w:rPr/>
-              <w:t xml:space="preserve">To compare Random Forest, SVM (RBF) and XGBoost individually and combined in a stacking ensemble.</w:t>
+              <w:t>To train Random Forest, SVM and XGBoost on these features, compare them on the same test set, and see whether stacking the three beats the best single model. Ekbote et al. (2022) also used Random Forest and XGBoost, but on VGG16 features and one model at a time.</w:t>
             </w:r>
           </w:p>
           <w:p>
@@ -1806,8 +1807,7 @@
               <w:jc w:val="both"/>
             </w:pPr>
             <w:r>
-              <w:rPr/>
-              <w:t xml:space="preserve">To explain every prediction with SHAP and to identify the most frequently confused character pairs.</w:t>
+              <w:t>To explain every prediction with SHAP, and to find out which character pairs get confused the most and which part of the character causes the confusion. Anam and Gupta (2015) and Kolte and Gupta (2025) both point out that similar looking characters are the main problem, but neither of them lists which ones.</w:t>
             </w:r>
           </w:p>
           <w:p>
@@ -1820,8 +1820,7 @@
               <w:jc w:val="both"/>
             </w:pPr>
             <w:r>
-              <w:rPr/>
-              <w:t xml:space="preserve">To measure, with a learning curve from 72 to 2,000 training images per class, where handcrafted features stop being competitive with an untuned reference CNN trained on identical data.</w:t>
+              <w:t>To find the training set size at which a plain CNN starts doing better than our classical pipeline. Both are trained on the same splits, from 72 to 2,000 images per class, and tested on the same 11,400 images, so the comparison is fair. Chandankhede et al. (2025) got 97% on test but only 45% on validation with about 21 images per class, which is why we wanted to measure this instead of just assuming deep learning wins.</w:t>
             </w:r>
           </w:p>
           <w:p>
@@ -1834,8 +1833,7 @@
               <w:jc w:val="both"/>
             </w:pPr>
             <w:r>
-              <w:rPr/>
-              <w:t xml:space="preserve">To deliver an interactive web application that recognises multi-character images and explains each character's prediction.</w:t>
+              <w:t>To make a web app that works on both phones and laptops, where you can upload a photo or draw a character and see the predicted character, how confident the model is and why it decided that. It should also split a line of separate characters, since Solanki and Ingle (2019) only worked with single characters.</w:t>
             </w:r>
           </w:p>
           <w:p>
@@ -1887,7 +1885,8 @@
               <w:rPr>
                 <w:lang w:eastAsia="en-IN" w:bidi="mr-IN"/>
               </w:rPr>
-              <w:t xml:space="preserve">Recognition of 57 isolated handwritten Modi character classes (10 digits, 12 vowels and 35 consonants) from the public MODI-HChar dataset of 575,912 images.</w:t>
+              <w:lastRenderedPageBreak/>
+              <w:t>Recognition of 57 isolated handwritten Modi character classes (10 digits, 12 vowels and 35 consonants) from the public MODI-HChar dataset of 575,912 images.</w:t>
             </w:r>
           </w:p>
           <w:p>
@@ -1906,7 +1905,7 @@
               <w:rPr>
                 <w:lang w:eastAsia="en-IN" w:bidi="mr-IN"/>
               </w:rPr>
-              <w:t xml:space="preserve">Image preprocessing: grayscale conversion, Otsu binarisation, scan-frame and noise removal, and size normalisation.</w:t>
+              <w:t>Image preprocessing: grayscale conversion, Otsu binarisation, scan-frame and noise removal, and size normalisation.</w:t>
             </w:r>
           </w:p>
           <w:p>
@@ -1925,7 +1924,7 @@
               <w:rPr>
                 <w:lang w:eastAsia="en-IN" w:bidi="mr-IN"/>
               </w:rPr>
-              <w:t xml:space="preserve">Segmentation of images containing several separated characters into individual characters in reading order.</w:t>
+              <w:t>Segmentation of images containing several separated characters into individual characters in reading order.</w:t>
             </w:r>
           </w:p>
           <w:p>
@@ -1944,7 +1943,7 @@
               <w:rPr>
                 <w:lang w:eastAsia="en-IN" w:bidi="mr-IN"/>
               </w:rPr>
-              <w:t xml:space="preserve">Feature extraction, dimensionality reduction (PCA / LDA), classification and per-class error analysis.</w:t>
+              <w:t>Feature extraction, dimensionality reduction (PCA / LDA), classification and per-class error analysis.</w:t>
             </w:r>
           </w:p>
           <w:p>
@@ -1963,7 +1962,7 @@
               <w:rPr>
                 <w:lang w:eastAsia="en-IN" w:bidi="mr-IN"/>
               </w:rPr>
-              <w:t xml:space="preserve">Explainable output for every prediction through a Streamlit web application.</w:t>
+              <w:t>Explainable output for every prediction through a web application that works on phones and laptops.</w:t>
             </w:r>
           </w:p>
           <w:p>
@@ -1982,7 +1981,7 @@
               <w:rPr>
                 <w:lang w:eastAsia="en-IN" w:bidi="mr-IN"/>
               </w:rPr>
-              <w:t xml:space="preserve">Reliable segmentation of continuous cursive manuscripts and full document transliteration are kept as future scope.</w:t>
+              <w:t>Reliable segmentation of continuous cursive manuscripts and full document transliteration are kept as future scope.</w:t>
             </w:r>
           </w:p>
           <w:p>
@@ -2017,7 +2016,7 @@
               <w:rPr>
                 <w:lang w:eastAsia="en-IN" w:bidi="mr-IN"/>
               </w:rPr>
-              <w:t xml:space="preserve">The methodology follows a reproducible classical machine-learning pipeline with a fixed random seed:</w:t>
+              <w:t>The methodology follows a reproducible classical machine-learning pipeline with a fixed random seed:</w:t>
             </w:r>
           </w:p>
           <w:p>
@@ -2035,7 +2034,7 @@
               <w:rPr>
                 <w:lang w:eastAsia="en-IN" w:bidi="mr-IN"/>
               </w:rPr>
-              <w:t xml:space="preserve">Data Collection</w:t>
+              <w:t>Data Collection</w:t>
             </w:r>
           </w:p>
           <w:p>
@@ -2053,7 +2052,7 @@
               <w:rPr>
                 <w:lang w:eastAsia="en-IN" w:bidi="mr-IN"/>
               </w:rPr>
-              <w:t xml:space="preserve">Download the MODI-HDC dataset from Kaggle and count the classes and images from disk instead of relying on published figures.</w:t>
+              <w:t>Download the MODI-HDC dataset from Kaggle and count the classes and images from disk instead of relying on published figures.</w:t>
             </w:r>
           </w:p>
           <w:p>
@@ -2071,7 +2070,7 @@
               <w:rPr>
                 <w:lang w:eastAsia="en-IN" w:bidi="mr-IN"/>
               </w:rPr>
-              <w:t xml:space="preserve">Create one seeded ordering per class: a fixed test set of 200 images per class and nested training sets of 72 to 2,000 images per class.</w:t>
+              <w:t>Create one seeded ordering per class: a fixed test set of 200 images per class and nested training sets of 72 to 2,000 images per class.</w:t>
             </w:r>
           </w:p>
           <w:p>
@@ -2089,7 +2088,7 @@
               <w:rPr>
                 <w:lang w:eastAsia="en-IN" w:bidi="mr-IN"/>
               </w:rPr>
-              <w:t xml:space="preserve">Data Pre-processing</w:t>
+              <w:t>Data Pre-processing</w:t>
             </w:r>
           </w:p>
           <w:p>
@@ -2107,7 +2106,7 @@
               <w:rPr>
                 <w:lang w:eastAsia="en-IN" w:bidi="mr-IN"/>
               </w:rPr>
-              <w:t xml:space="preserve">Convert to grayscale, apply median filtering and Otsu binarisation with automatic ink polarity detection.</w:t>
+              <w:t>Convert to grayscale, apply median filtering and Otsu binarisation with automatic ink polarity detection.</w:t>
             </w:r>
           </w:p>
           <w:p>
@@ -2125,7 +2124,7 @@
               <w:rPr>
                 <w:lang w:eastAsia="en-IN" w:bidi="mr-IN"/>
               </w:rPr>
-              <w:t xml:space="preserve">Remove scan-frame lines and specks, reject blank images, and centre and resize each character to 64 x 64 pixels.</w:t>
+              <w:t>Remove scan-frame lines and specks, reject blank images, and centre and resize each character to 64 x 64 pixels.</w:t>
             </w:r>
           </w:p>
           <w:p>
@@ -2143,7 +2142,7 @@
               <w:rPr>
                 <w:lang w:eastAsia="en-IN" w:bidi="mr-IN"/>
               </w:rPr>
-              <w:t xml:space="preserve">Segmentation of Multi-character Images</w:t>
+              <w:t>Segmentation of Multi-character Images</w:t>
             </w:r>
           </w:p>
           <w:p>
@@ -2161,7 +2160,7 @@
               <w:rPr>
                 <w:lang w:eastAsia="en-IN" w:bidi="mr-IN"/>
               </w:rPr>
-              <w:t xml:space="preserve">Correct skew and find text lines with the horizontal projection profile.</w:t>
+              <w:t>Correct skew and find text lines with the horizontal projection profile.</w:t>
             </w:r>
           </w:p>
           <w:p>
@@ -2179,7 +2178,7 @@
               <w:rPr>
                 <w:lang w:eastAsia="en-IN" w:bidi="mr-IN"/>
               </w:rPr>
-              <w:t xml:space="preserve">Split characters using the vertical projection, headline (shirorekha) handling and connected components, and flag unreliable boxes.</w:t>
+              <w:t>Split characters using the vertical projection, headline (shirorekha) handling and connected components, and flag unreliable boxes.</w:t>
             </w:r>
           </w:p>
           <w:p>
@@ -2197,7 +2196,7 @@
               <w:rPr>
                 <w:lang w:eastAsia="en-IN" w:bidi="mr-IN"/>
               </w:rPr>
-              <w:t xml:space="preserve">Feature Extraction</w:t>
+              <w:t>Feature Extraction</w:t>
             </w:r>
           </w:p>
           <w:p>
@@ -2215,7 +2214,7 @@
               <w:rPr>
                 <w:lang w:eastAsia="en-IN" w:bidi="mr-IN"/>
               </w:rPr>
-              <w:t xml:space="preserve">HOG for stroke direction (1,764 features) and Zernike moments for rotation-invariant global shape (49 features).</w:t>
+              <w:t>HOG for stroke direction (1,764 features) and Zernike moments for rotation-invariant global shape (49 features).</w:t>
             </w:r>
           </w:p>
           <w:p>
@@ -2233,7 +2232,7 @@
               <w:rPr>
                 <w:lang w:eastAsia="en-IN" w:bidi="mr-IN"/>
               </w:rPr>
-              <w:t xml:space="preserve">LBP for local stroke patterns at junctions and stroke ends (448 features).</w:t>
+              <w:t>LBP for local stroke patterns at junctions and stroke ends (448 features).</w:t>
             </w:r>
           </w:p>
           <w:p>
@@ -2251,7 +2250,7 @@
               <w:rPr>
                 <w:lang w:eastAsia="en-IN" w:bidi="mr-IN"/>
               </w:rPr>
-              <w:t xml:space="preserve">Feature Fusion and Dimensionality Reduction</w:t>
+              <w:t>Feature Fusion and Dimensionality Reduction</w:t>
             </w:r>
           </w:p>
           <w:p>
@@ -2269,7 +2268,7 @@
               <w:rPr>
                 <w:lang w:eastAsia="en-IN" w:bidi="mr-IN"/>
               </w:rPr>
-              <w:t xml:space="preserve">Standardise and fuse the three descriptors with family-balanced weighting (2,261 features).</w:t>
+              <w:t>Standardise and fuse the three descriptors with family-balanced weighting (2,261 features).</w:t>
             </w:r>
           </w:p>
           <w:p>
@@ -2287,7 +2286,7 @@
               <w:rPr>
                 <w:lang w:eastAsia="en-IN" w:bidi="mr-IN"/>
               </w:rPr>
-              <w:t xml:space="preserve">Reduce dimensionality with PCA, with LDA as a comparison.</w:t>
+              <w:t>Compare PCA and LDA using cross-validation on the training data only, and keep the better one (LDA).</w:t>
             </w:r>
           </w:p>
           <w:p>
@@ -2305,7 +2304,7 @@
               <w:rPr>
                 <w:lang w:eastAsia="en-IN" w:bidi="mr-IN"/>
               </w:rPr>
-              <w:t xml:space="preserve">Classification</w:t>
+              <w:t>Classification</w:t>
             </w:r>
           </w:p>
           <w:p>
@@ -2323,7 +2322,7 @@
               <w:rPr>
                 <w:lang w:eastAsia="en-IN" w:bidi="mr-IN"/>
               </w:rPr>
-              <w:t xml:space="preserve">Train Random Forest, SVM (RBF) and XGBoost separately and combine them in a stacking ensemble with a logistic-regression meta-learner.</w:t>
+              <w:t>Train Random Forest, SVM (RBF) and XGBoost separately and combine them in a stacking ensemble with a logistic-regression meta-learner.</w:t>
             </w:r>
           </w:p>
           <w:p>
@@ -2341,7 +2340,7 @@
               <w:rPr>
                 <w:lang w:eastAsia="en-IN" w:bidi="mr-IN"/>
               </w:rPr>
-              <w:t xml:space="preserve">Use stratified splits and cross-validation on the training data only.</w:t>
+              <w:t>Use stratified splits and cross-validation on the training data only.</w:t>
             </w:r>
           </w:p>
           <w:p>
@@ -2359,7 +2358,7 @@
               <w:rPr>
                 <w:lang w:eastAsia="en-IN" w:bidi="mr-IN"/>
               </w:rPr>
-              <w:t xml:space="preserve">Evaluation</w:t>
+              <w:t>Evaluation</w:t>
             </w:r>
           </w:p>
           <w:p>
@@ -2377,7 +2376,7 @@
               <w:rPr>
                 <w:lang w:eastAsia="en-IN" w:bidi="mr-IN"/>
               </w:rPr>
-              <w:t xml:space="preserve">Report accuracy, macro precision, recall and F1, per-class and per-category results, the confusion matrix and the most confused character pairs.</w:t>
+              <w:t>Report accuracy, macro precision, recall and F1, per-class and per-category results, the confusion matrix and the most confused character pairs.</w:t>
             </w:r>
           </w:p>
           <w:p>
@@ -2395,7 +2394,7 @@
               <w:rPr>
                 <w:lang w:eastAsia="en-IN" w:bidi="mr-IN"/>
               </w:rPr>
-              <w:t xml:space="preserve">Run an ablation of single descriptors against fused features and a learning curve against an untuned reference CNN on identical splits.</w:t>
+              <w:t>Run an ablation of single descriptors against fused features and a learning curve against an untuned reference CNN on identical splits.</w:t>
             </w:r>
           </w:p>
           <w:p>
@@ -2413,7 +2412,7 @@
               <w:rPr>
                 <w:lang w:eastAsia="en-IN" w:bidi="mr-IN"/>
               </w:rPr>
-              <w:t xml:space="preserve">Explainability and Deployment</w:t>
+              <w:t>Explainability and Deployment</w:t>
             </w:r>
           </w:p>
           <w:p>
@@ -2431,7 +2430,7 @@
               <w:rPr>
                 <w:lang w:eastAsia="en-IN" w:bidi="mr-IN"/>
               </w:rPr>
-              <w:t xml:space="preserve">Explain predictions with grouped SHAP: global importance, per-prediction explanations and contrastive explanations for confused pairs.</w:t>
+              <w:t>Explain predictions with grouped SHAP: global importance, per-prediction explanations and contrastive explanations for confused pairs.</w:t>
             </w:r>
           </w:p>
           <w:p>
@@ -2449,7 +2448,7 @@
               <w:rPr>
                 <w:lang w:eastAsia="en-IN" w:bidi="mr-IN"/>
               </w:rPr>
-              <w:t xml:space="preserve">Deploy an interactive Streamlit application with recognition and pipeline-dashboard views.</w:t>
+              <w:t>Deploy a web application with Home, Read, Results, Explain and Script pages.</w:t>
             </w:r>
           </w:p>
           <w:p>
@@ -2485,12 +2484,10 @@
             </w:pPr>
             <w:r>
               <w:rPr>
-                <w:b/>
-                <w:bCs/>
                 <w:sz w:val="24"/>
                 <w:szCs w:val="24"/>
               </w:rPr>
-              <w:t xml:space="preserve">Hardware Requirements</w:t>
+              <w:t>Hardware Requirements</w:t>
             </w:r>
           </w:p>
           <w:p>
@@ -2510,7 +2507,7 @@
               <w:rPr>
                 <w:lang w:eastAsia="en-IN" w:bidi="mr-IN"/>
               </w:rPr>
-              <w:t xml:space="preserve">Processor: Intel Core i5 / AMD Ryzen 5 or above (CPU only; no GPU required)</w:t>
+              <w:t>Processor: Intel Core i5 / AMD Ryzen 5 or above (CPU only; no GPU required)</w:t>
             </w:r>
           </w:p>
           <w:p>
@@ -2530,7 +2527,7 @@
               <w:rPr>
                 <w:lang w:eastAsia="en-IN" w:bidi="mr-IN"/>
               </w:rPr>
-              <w:t xml:space="preserve">RAM: Minimum 8 GB (16 GB recommended for training)</w:t>
+              <w:t>RAM: Minimum 8 GB (16 GB recommended for training)</w:t>
             </w:r>
           </w:p>
           <w:p>
@@ -2550,7 +2547,7 @@
               <w:rPr>
                 <w:lang w:eastAsia="en-IN" w:bidi="mr-IN"/>
               </w:rPr>
-              <w:t xml:space="preserve">Storage: Minimum 20 GB of free space (dataset download and cached features)</w:t>
+              <w:t>Storage: Minimum 20 GB of free space (dataset download and cached features)</w:t>
             </w:r>
           </w:p>
           <w:p>
@@ -2570,7 +2567,7 @@
               <w:rPr>
                 <w:lang w:eastAsia="en-IN" w:bidi="mr-IN"/>
               </w:rPr>
-              <w:t xml:space="preserve">Internet Connection: Required only for the one-time dataset download</w:t>
+              <w:t>Internet Connection: Required only for the one-time dataset download</w:t>
             </w:r>
           </w:p>
           <w:p>
@@ -2587,7 +2584,7 @@
               <w:rPr>
                 <w:lang w:eastAsia="en-IN" w:bidi="mr-IN"/>
               </w:rPr>
-              <w:t xml:space="preserve">Software Requirements</w:t>
+              <w:t>Software Requirements</w:t>
             </w:r>
           </w:p>
           <w:p>
@@ -2607,7 +2604,7 @@
               <w:rPr>
                 <w:lang w:eastAsia="en-IN" w:bidi="mr-IN"/>
               </w:rPr>
-              <w:t xml:space="preserve">Operating System: Windows / Linux</w:t>
+              <w:t>Operating System: Windows / Linux</w:t>
             </w:r>
           </w:p>
           <w:p>
@@ -2627,7 +2624,7 @@
               <w:rPr>
                 <w:lang w:eastAsia="en-IN" w:bidi="mr-IN"/>
               </w:rPr>
-              <w:t xml:space="preserve">Programming Language: Python 3.11 or above</w:t>
+              <w:t>Programming Language: Python 3.11 or above</w:t>
             </w:r>
           </w:p>
           <w:p>
@@ -2647,7 +2644,7 @@
               <w:rPr>
                 <w:lang w:eastAsia="en-IN" w:bidi="mr-IN"/>
               </w:rPr>
-              <w:t xml:space="preserve">Image Processing: OpenCV, scikit-image, mahotas</w:t>
+              <w:t>Image Processing: OpenCV, scikit-image, mahotas</w:t>
             </w:r>
           </w:p>
           <w:p>
@@ -2667,7 +2664,7 @@
               <w:rPr>
                 <w:lang w:eastAsia="en-IN" w:bidi="mr-IN"/>
               </w:rPr>
-              <w:t xml:space="preserve">Machine Learning: scikit-learn, XGBoost</w:t>
+              <w:t>Machine Learning: scikit-learn, XGBoost</w:t>
             </w:r>
           </w:p>
           <w:p>
@@ -2687,7 +2684,7 @@
               <w:rPr>
                 <w:lang w:eastAsia="en-IN" w:bidi="mr-IN"/>
               </w:rPr>
-              <w:t xml:space="preserve">Explainability: SHAP</w:t>
+              <w:t>Explainability: SHAP</w:t>
             </w:r>
           </w:p>
           <w:p>
@@ -2707,7 +2704,7 @@
               <w:rPr>
                 <w:lang w:eastAsia="en-IN" w:bidi="mr-IN"/>
               </w:rPr>
-              <w:t xml:space="preserve">Data Processing and Visualisation: NumPy, Pandas, Matplotlib, Plotly</w:t>
+              <w:t>Data Processing and Visualisation: NumPy, Pandas, Matplotlib</w:t>
             </w:r>
           </w:p>
           <w:p>
@@ -2727,7 +2724,7 @@
               <w:rPr>
                 <w:lang w:eastAsia="en-IN" w:bidi="mr-IN"/>
               </w:rPr>
-              <w:t xml:space="preserve">Reference Baseline only: PyTorch (CPU)</w:t>
+              <w:t>Reference Baseline only: PyTorch (CPU)</w:t>
             </w:r>
           </w:p>
           <w:p>
@@ -2747,7 +2744,7 @@
               <w:rPr>
                 <w:lang w:eastAsia="en-IN" w:bidi="mr-IN"/>
               </w:rPr>
-              <w:t xml:space="preserve">Application Development: Streamlit</w:t>
+              <w:t>Application Development: Starlette (Python web framework) with HTML, CSS and JavaScript</w:t>
             </w:r>
           </w:p>
           <w:p>
@@ -2767,7 +2764,7 @@
               <w:rPr>
                 <w:lang w:eastAsia="en-IN" w:bidi="mr-IN"/>
               </w:rPr>
-              <w:t xml:space="preserve">Development Environment: Jupyter Notebook / Visual Studio Code, Git</w:t>
+              <w:t>Development Environment: Jupyter Notebook / Visual Studio Code, Git</w:t>
             </w:r>
           </w:p>
           <w:p>
@@ -2817,8 +2814,7 @@
               <w:jc w:val="both"/>
             </w:pPr>
             <w:r>
-              <w:rPr/>
-              <w:t xml:space="preserve">The project is designed to have a low environmental footprint. It runs entirely on an ordinary laptop CPU without GPUs, uses classical models that train far faster than deep networks, and caches intermediate results such as processed images and extracted features so that experiments are not recomputed. Digitising and reading archival documents also reduces the need to physically handle fragile paper records, which helps to preserve them.</w:t>
+              <w:t>The project is designed to have a low environmental footprint. It runs entirely on an ordinary laptop CPU without GPUs, uses classical models that train far faster than deep networks, and caches intermediate results such as processed images and extracted features so that experiments are not recomputed. Digitising and reading archival documents also reduces the need to physically handle fragile paper records, which helps to preserve them.</w:t>
             </w:r>
           </w:p>
           <w:p>
@@ -2879,7 +2875,7 @@
               <w:rPr>
                 <w:lang w:eastAsia="en-IN"/>
               </w:rPr>
-              <w:t xml:space="preserve">Sustainability covers both technical sustainability and long-term usefulness of the system.</w:t>
+              <w:t>Sustainability covers both technical sustainability and long-term usefulness of the system.</w:t>
             </w:r>
           </w:p>
           <w:p>
@@ -2899,7 +2895,7 @@
               <w:rPr>
                 <w:lang w:eastAsia="en-IN"/>
               </w:rPr>
-              <w:t xml:space="preserve">Project-specific considerations: The system is designed to be:</w:t>
+              <w:t>Project-specific considerations: The system is designed to be:</w:t>
             </w:r>
           </w:p>
           <w:p>
@@ -2919,7 +2915,7 @@
               <w:rPr>
                 <w:lang w:eastAsia="en-IN"/>
               </w:rPr>
-              <w:t xml:space="preserve">Modular - preprocessing, segmentation, feature extraction, models, evaluation and explanation are separate modules that can be improved independently.</w:t>
+              <w:t>Modular - preprocessing, segmentation, feature extraction, models, evaluation and explanation are separate modules that can be improved independently.</w:t>
             </w:r>
           </w:p>
           <w:p>
@@ -2939,7 +2935,7 @@
               <w:rPr>
                 <w:lang w:eastAsia="en-IN"/>
               </w:rPr>
-              <w:t xml:space="preserve">Reproducible - a fixed random seed, pinned library versions and cached results give the same output on every run.</w:t>
+              <w:t>Reproducible - a fixed random seed, pinned library versions and cached results give the same output on every run.</w:t>
             </w:r>
           </w:p>
           <w:p>
@@ -2959,7 +2955,7 @@
               <w:rPr>
                 <w:lang w:eastAsia="en-IN"/>
               </w:rPr>
-              <w:t xml:space="preserve">Configurable - every tunable parameter is kept in one configuration file.</w:t>
+              <w:t>Configurable - every tunable parameter is kept in one configuration file.</w:t>
             </w:r>
           </w:p>
           <w:p>
@@ -2979,7 +2975,7 @@
               <w:rPr>
                 <w:lang w:eastAsia="en-IN"/>
               </w:rPr>
-              <w:t xml:space="preserve">Lightweight - CPU-only training and inference make it usable without specialised hardware.</w:t>
+              <w:t>Lightweight - CPU-only training and inference make it usable without specialised hardware.</w:t>
             </w:r>
           </w:p>
           <w:p>
@@ -2999,7 +2995,7 @@
               <w:rPr>
                 <w:lang w:eastAsia="en-IN"/>
               </w:rPr>
-              <w:t xml:space="preserve">Extensible - new descriptors, classifiers, character classes or datasets can be added without redesigning the pipeline.</w:t>
+              <w:t>Extensible - new descriptors, classifiers, character classes or datasets can be added without redesigning the pipeline.</w:t>
             </w:r>
           </w:p>
           <w:p>
@@ -3019,7 +3015,7 @@
               <w:rPr>
                 <w:lang w:eastAsia="en-IN"/>
               </w:rPr>
-              <w:t xml:space="preserve">Tested - automated tests check the data splits, preprocessing, features, segmentation and the web application.</w:t>
+              <w:t>Tested - automated tests check the data splits, preprocessing, features, segmentation and the web application.</w:t>
             </w:r>
           </w:p>
           <w:p>
@@ -3060,8 +3056,7 @@
               <w:jc w:val="both"/>
             </w:pPr>
             <w:r>
-              <w:rPr/>
-              <w:t xml:space="preserve">The system is a research prototype that assists human readers of Modi documents; it is not an authoritative transcription service. Its safety measures focus on making uncertainty visible and on secure handling of uploaded images.</w:t>
+              <w:t>The system is a research prototype that assists human readers of Modi documents; it is not an authoritative transcription service. Its safety measures focus on making uncertainty visible and on secure handling of uploaded images.</w:t>
             </w:r>
           </w:p>
           <w:p>
@@ -3078,12 +3073,10 @@
             </w:pPr>
             <w:r>
               <w:rPr>
-                <w:b/>
-                <w:bCs/>
                 <w:sz w:val="24"/>
                 <w:szCs w:val="24"/>
               </w:rPr>
-              <w:t xml:space="preserve">Safety Considerations</w:t>
+              <w:t>Safety Considerations</w:t>
             </w:r>
           </w:p>
           <w:p>
@@ -3097,8 +3090,7 @@
               <w:jc w:val="both"/>
             </w:pPr>
             <w:r>
-              <w:rPr/>
-              <w:t xml:space="preserve">Confidence score for every predicted character with green, amber and red levels.</w:t>
+              <w:t>Confidence score for every predicted character with green, amber and red levels.</w:t>
             </w:r>
           </w:p>
           <w:p>
@@ -3112,8 +3104,7 @@
               <w:jc w:val="both"/>
             </w:pPr>
             <w:r>
-              <w:rPr/>
-              <w:t xml:space="preserve">Clear flags for unreliable segmentation (merged, fragmented or connected characters).</w:t>
+              <w:t>Clear flags for unreliable segmentation (merged, fragmented or connected characters).</w:t>
             </w:r>
           </w:p>
           <w:p>
@@ -3127,8 +3118,7 @@
               <w:jc w:val="both"/>
             </w:pPr>
             <w:r>
-              <w:rPr/>
-              <w:t xml:space="preserve">Top-3 alternatives and SHAP explanations so that users can check every decision.</w:t>
+              <w:t>Top-3 alternatives and SHAP explanations so that users can check every decision.</w:t>
             </w:r>
           </w:p>
           <w:p>
@@ -3142,8 +3132,7 @@
               <w:jc w:val="both"/>
             </w:pPr>
             <w:r>
-              <w:rPr/>
-              <w:t xml:space="preserve">Honest reporting of accuracy limits and failure cases.</w:t>
+              <w:t>Honest reporting of accuracy limits and failure cases.</w:t>
             </w:r>
           </w:p>
           <w:p>
@@ -3157,8 +3146,7 @@
               <w:jc w:val="both"/>
             </w:pPr>
             <w:r>
-              <w:rPr/>
-              <w:t xml:space="preserve">Human verification of transcriptions before any scholarly or legal use.</w:t>
+              <w:t>Human verification of transcriptions before any scholarly or legal use.</w:t>
             </w:r>
           </w:p>
           <w:p>
@@ -3175,12 +3163,10 @@
             </w:pPr>
             <w:r>
               <w:rPr>
-                <w:b/>
-                <w:bCs/>
                 <w:sz w:val="24"/>
                 <w:szCs w:val="24"/>
               </w:rPr>
-              <w:t xml:space="preserve">Cybersecurity</w:t>
+              <w:t>Cybersecurity</w:t>
             </w:r>
           </w:p>
           <w:p>
@@ -3194,8 +3180,7 @@
               <w:jc w:val="both"/>
             </w:pPr>
             <w:r>
-              <w:rPr/>
-              <w:t xml:space="preserve">Uploaded images are processed locally and are not stored or shared.</w:t>
+              <w:t>Uploaded images are processed locally and are not stored or shared.</w:t>
             </w:r>
           </w:p>
           <w:p>
@@ -3209,8 +3194,7 @@
               <w:jc w:val="both"/>
             </w:pPr>
             <w:r>
-              <w:rPr/>
-              <w:t xml:space="preserve">Validation of uploaded files (type, size and readability) before processing.</w:t>
+              <w:t>Validation of uploaded files (type, size and readability) before processing.</w:t>
             </w:r>
           </w:p>
           <w:p>
@@ -3224,8 +3208,7 @@
               <w:jc w:val="both"/>
             </w:pPr>
             <w:r>
-              <w:rPr/>
-              <w:t xml:space="preserve">Upload size limit to prevent misuse of the application.</w:t>
+              <w:t>Upload size limit to prevent misuse of the application.</w:t>
             </w:r>
           </w:p>
           <w:p>
@@ -3239,8 +3222,7 @@
               <w:jc w:val="both"/>
             </w:pPr>
             <w:r>
-              <w:rPr/>
-              <w:t xml:space="preserve">Dataset API credentials are kept out of version control.</w:t>
+              <w:t>Dataset API credentials are kept out of version control.</w:t>
             </w:r>
           </w:p>
           <w:p>
@@ -3272,7 +3254,6 @@
                 <w:bCs/>
                 <w:lang w:eastAsia="en-IN"/>
               </w:rPr>
-              <w:lastRenderedPageBreak/>
               <w:t xml:space="preserve"> Ethics</w:t>
             </w:r>
           </w:p>
@@ -3282,8 +3263,7 @@
               <w:jc w:val="both"/>
             </w:pPr>
             <w:r>
-              <w:rPr/>
-              <w:t xml:space="preserve">Modi documents are part of Maharashtra's cultural heritage and may contain land, legal and family records. The project addresses the responsible use of AI for such material through transparency, honest reporting and human oversight.</w:t>
+              <w:t>Modi documents are part of Maharashtra's cultural heritage and may contain land, legal and family records. The project addresses the responsible use of AI for such material through transparency, honest reporting and human oversight.</w:t>
             </w:r>
           </w:p>
           <w:p>
@@ -3300,12 +3280,10 @@
             </w:pPr>
             <w:r>
               <w:rPr>
-                <w:b/>
-                <w:bCs/>
                 <w:sz w:val="24"/>
                 <w:szCs w:val="24"/>
               </w:rPr>
-              <w:t xml:space="preserve">Important Considerations</w:t>
+              <w:t>Important Considerations</w:t>
             </w:r>
           </w:p>
           <w:p>
@@ -3327,8 +3305,7 @@
               <w:t xml:space="preserve">Transparency: </w:t>
             </w:r>
             <w:r>
-              <w:rPr/>
-              <w:t xml:space="preserve">Every prediction is accompanied by a SHAP explanation showing which parts of the character influenced the decision.</w:t>
+              <w:t>Every prediction is accompanied by a SHAP explanation showing which parts of the character influenced the decision.</w:t>
             </w:r>
           </w:p>
           <w:p>
@@ -3350,8 +3327,7 @@
               <w:t xml:space="preserve">Honest Reporting: </w:t>
             </w:r>
             <w:r>
-              <w:rPr/>
-              <w:t xml:space="preserve">Results are reported on a fixed public test set, including cases where a method performed worse than expected.</w:t>
+              <w:t>Results are reported on a fixed public test set, including cases where a method performed worse than expected.</w:t>
             </w:r>
           </w:p>
           <w:p>
@@ -3373,8 +3349,7 @@
               <w:t xml:space="preserve">Data Licensing: </w:t>
             </w:r>
             <w:r>
-              <w:rPr/>
-              <w:t xml:space="preserve">The MODI-HDC dataset is published under a CC0 public-domain licence.</w:t>
+              <w:t>The MODI-HDC dataset is published under a CC0 public-domain licence.</w:t>
             </w:r>
           </w:p>
           <w:p>
@@ -3396,8 +3371,7 @@
               <w:t xml:space="preserve">Dataset Bias: </w:t>
             </w:r>
             <w:r>
-              <w:rPr/>
-              <w:t xml:space="preserve">Handwriting from a limited group of writers may not represent every historical period or writing style; this limitation is stated clearly.</w:t>
+              <w:t>Handwriting from a limited group of writers may not represent every historical period or writing style; this limitation is stated clearly.</w:t>
             </w:r>
           </w:p>
           <w:p>
@@ -3419,8 +3393,7 @@
               <w:t xml:space="preserve">Human Oversight: </w:t>
             </w:r>
             <w:r>
-              <w:rPr/>
-              <w:t xml:space="preserve">Outputs are aids for trained readers and are not treated as authoritative transcriptions.</w:t>
+              <w:t>Outputs are aids for trained readers and are not treated as authoritative transcriptions.</w:t>
             </w:r>
           </w:p>
           <w:p>
@@ -3442,8 +3415,7 @@
               <w:t xml:space="preserve">Cultural Respect: </w:t>
             </w:r>
             <w:r>
-              <w:rPr/>
-              <w:t xml:space="preserve">Character labels and transliterations are checked against reference examples instead of being guessed.</w:t>
+              <w:t>Character labels and transliterations are checked against reference examples instead of being guessed.</w:t>
             </w:r>
           </w:p>
           <w:p>
@@ -3484,8 +3456,7 @@
               <w:jc w:val="both"/>
             </w:pPr>
             <w:r>
-              <w:rPr/>
-              <w:t xml:space="preserve">The project has a very low cost because it uses a free public dataset, open-source software and an ordinary laptop; no GPU, paid API or cloud training is required.</w:t>
+              <w:t>The project has a very low cost because it uses a free public dataset, open-source software and an ordinary laptop; no GPU, paid API or cloud training is required.</w:t>
             </w:r>
           </w:p>
           <w:p>
@@ -3502,12 +3473,10 @@
             </w:pPr>
             <w:r>
               <w:rPr>
-                <w:b/>
-                <w:bCs/>
                 <w:sz w:val="24"/>
                 <w:szCs w:val="24"/>
               </w:rPr>
-              <w:t xml:space="preserve">Cost Factors</w:t>
+              <w:t>Cost Factors</w:t>
             </w:r>
           </w:p>
           <w:p>
@@ -3521,8 +3490,7 @@
               <w:jc w:val="both"/>
             </w:pPr>
             <w:r>
-              <w:rPr/>
-              <w:t xml:space="preserve">Dataset acquisition: free (public Kaggle dataset, CC0 licence)</w:t>
+              <w:t>Dataset acquisition: free (public Kaggle dataset, CC0 licence)</w:t>
             </w:r>
           </w:p>
           <w:p>
@@ -3536,8 +3504,7 @@
               <w:jc w:val="both"/>
             </w:pPr>
             <w:r>
-              <w:rPr/>
-              <w:t xml:space="preserve">Software and libraries: free and open source</w:t>
+              <w:t>Software and libraries: free and open source</w:t>
             </w:r>
           </w:p>
           <w:p>
@@ -3551,8 +3518,7 @@
               <w:jc w:val="both"/>
             </w:pPr>
             <w:r>
-              <w:rPr/>
-              <w:t xml:space="preserve">Hardware: existing laptop; no GPU or cloud training needed</w:t>
+              <w:t>Hardware: existing laptop; no GPU or cloud training needed</w:t>
             </w:r>
           </w:p>
           <w:p>
@@ -3566,8 +3532,7 @@
               <w:jc w:val="both"/>
             </w:pPr>
             <w:r>
-              <w:rPr/>
-              <w:t xml:space="preserve">Development time for implementation, experiments and documentation</w:t>
+              <w:t>Development time for implementation, experiments and documentation</w:t>
             </w:r>
           </w:p>
           <w:p>
@@ -3581,8 +3546,7 @@
               <w:jc w:val="both"/>
             </w:pPr>
             <w:r>
-              <w:rPr/>
-              <w:t xml:space="preserve">Optional cloud hosting of the web application for demonstration</w:t>
+              <w:t>Optional cloud hosting of the web application for demonstration</w:t>
             </w:r>
           </w:p>
           <w:p>
@@ -3596,8 +3560,7 @@
               <w:jc w:val="both"/>
             </w:pPr>
             <w:r>
-              <w:rPr/>
-              <w:t xml:space="preserve">Maintenance and retraining on new data</w:t>
+              <w:t>Maintenance and retraining on new data</w:t>
             </w:r>
           </w:p>
           <w:p>
@@ -3615,12 +3578,10 @@
             </w:pPr>
             <w:r>
               <w:rPr>
-                <w:b/>
-                <w:bCs/>
                 <w:sz w:val="24"/>
                 <w:szCs w:val="24"/>
               </w:rPr>
-              <w:t xml:space="preserve">Potential Economic Benefits</w:t>
+              <w:t>Potential Economic Benefits</w:t>
             </w:r>
           </w:p>
           <w:p>
@@ -3638,12 +3599,10 @@
             </w:pPr>
             <w:r>
               <w:rPr>
-                <w:b/>
-                <w:bCs/>
                 <w:sz w:val="24"/>
                 <w:szCs w:val="24"/>
               </w:rPr>
-              <w:t xml:space="preserve">The system can potentially reduce:</w:t>
+              <w:t>The system can potentially reduce:</w:t>
             </w:r>
           </w:p>
           <w:p>
@@ -3657,8 +3616,7 @@
               <w:jc w:val="both"/>
             </w:pPr>
             <w:r>
-              <w:rPr/>
-              <w:t xml:space="preserve">Manual effort and time needed to read archival Modi documents</w:t>
+              <w:t>Manual effort and time needed to read archival Modi documents</w:t>
             </w:r>
           </w:p>
           <w:p>
@@ -3672,8 +3630,7 @@
               <w:jc w:val="both"/>
             </w:pPr>
             <w:r>
-              <w:rPr/>
-              <w:t xml:space="preserve">Dependence on the very small number of expert Modi readers</w:t>
+              <w:t>Dependence on the very small number of expert Modi readers</w:t>
             </w:r>
           </w:p>
           <w:p>
@@ -3687,8 +3644,7 @@
               <w:jc w:val="both"/>
             </w:pPr>
             <w:r>
-              <w:rPr/>
-              <w:t xml:space="preserve">Cost of digitising and indexing historical archives</w:t>
+              <w:t>Cost of digitising and indexing historical archives</w:t>
             </w:r>
           </w:p>
           <w:p>
@@ -3702,8 +3658,7 @@
               <w:jc w:val="both"/>
             </w:pPr>
             <w:r>
-              <w:rPr/>
-              <w:t xml:space="preserve">Effort needed by students and researchers to learn the script</w:t>
+              <w:t>Effort needed by students and researchers to learn the script</w:t>
             </w:r>
           </w:p>
           <w:p>
@@ -3763,7 +3718,7 @@
                 <w:sz w:val="24"/>
                 <w:szCs w:val="24"/>
               </w:rPr>
-              <w:t xml:space="preserve">SDG 4 - Quality Education</w:t>
+              <w:t>SDG 4 - Quality Education</w:t>
             </w:r>
           </w:p>
           <w:p>
@@ -3776,8 +3731,7 @@
               <w:ind w:left="1080"/>
             </w:pPr>
             <w:r>
-              <w:rPr/>
-              <w:t xml:space="preserve">Provides an interactive tool for learning to read Modi characters.</w:t>
+              <w:t>Provides an interactive tool for learning to read Modi characters.</w:t>
             </w:r>
           </w:p>
           <w:p>
@@ -3790,8 +3744,7 @@
               <w:ind w:left="1080"/>
             </w:pPr>
             <w:r>
-              <w:rPr/>
-              <w:t xml:space="preserve">Explains each prediction, helping learners see how similar characters differ.</w:t>
+              <w:t>Explains each prediction, helping learners see how similar characters differ.</w:t>
             </w:r>
           </w:p>
           <w:p>
@@ -3804,8 +3757,7 @@
               <w:ind w:left="1080"/>
             </w:pPr>
             <w:r>
-              <w:rPr/>
-              <w:t xml:space="preserve">Supports students and researchers who work with historical sources.</w:t>
+              <w:t>Supports students and researchers who work with historical sources.</w:t>
             </w:r>
           </w:p>
           <w:p>
@@ -3823,7 +3775,7 @@
                 <w:sz w:val="24"/>
                 <w:szCs w:val="24"/>
               </w:rPr>
-              <w:t xml:space="preserve">SDG 9 - Industry, Innovation and Infrastructure</w:t>
+              <w:t>SDG 9 - Industry, Innovation and Infrastructure</w:t>
             </w:r>
           </w:p>
           <w:p>
@@ -3840,8 +3792,7 @@
               </w:rPr>
             </w:pPr>
             <w:r>
-              <w:rPr/>
-              <w:t xml:space="preserve">Applies data science and machine learning to document digitisation.</w:t>
+              <w:t>Applies data science and machine learning to document digitisation.</w:t>
             </w:r>
           </w:p>
           <w:p>
@@ -3858,8 +3809,7 @@
               </w:rPr>
             </w:pPr>
             <w:r>
-              <w:rPr/>
-              <w:t xml:space="preserve">Develops an explainable, CPU-friendly recognition system.</w:t>
+              <w:t>Develops an explainable, CPU-friendly recognition system.</w:t>
             </w:r>
           </w:p>
           <w:p>
@@ -3876,8 +3826,7 @@
               </w:rPr>
             </w:pPr>
             <w:r>
-              <w:rPr/>
-              <w:t xml:space="preserve">Contributes an open, reproducible pipeline that others can build on.</w:t>
+              <w:t>Contributes an open, reproducible pipeline that others can build on.</w:t>
             </w:r>
           </w:p>
           <w:p>
@@ -3895,7 +3844,7 @@
                 <w:sz w:val="24"/>
                 <w:szCs w:val="24"/>
               </w:rPr>
-              <w:t xml:space="preserve">SDG 11 - Sustainable Cities and Communities (Target 11.4: cultural heritage)</w:t>
+              <w:t>SDG 11 - Sustainable Cities and Communities (Target 11.4: cultural heritage)</w:t>
             </w:r>
           </w:p>
           <w:p>
@@ -3908,8 +3857,7 @@
               <w:ind w:left="1080"/>
             </w:pPr>
             <w:r>
-              <w:rPr/>
-              <w:t xml:space="preserve">Helps preserve and give access to Maharashtra's documentary heritage.</w:t>
+              <w:t>Helps preserve and give access to Maharashtra's documentary heritage.</w:t>
             </w:r>
           </w:p>
           <w:p>
@@ -3922,8 +3870,7 @@
               <w:ind w:left="1080"/>
             </w:pPr>
             <w:r>
-              <w:rPr/>
-              <w:t xml:space="preserve">Supports archives in digitising fragile historical records.</w:t>
+              <w:t>Supports archives in digitising fragile historical records.</w:t>
             </w:r>
           </w:p>
           <w:p>
@@ -3936,8 +3883,7 @@
               <w:ind w:left="1080"/>
             </w:pPr>
             <w:r>
-              <w:rPr/>
-              <w:t xml:space="preserve">Makes historical land and administrative records easier to read.</w:t>
+              <w:t>Makes historical land and administrative records easier to read.</w:t>
             </w:r>
           </w:p>
           <w:p>
@@ -3989,7 +3935,7 @@
                 <w:sz w:val="24"/>
                 <w:szCs w:val="24"/>
               </w:rPr>
-              <w:t xml:space="preserve">Application</w:t>
+              <w:t>Application</w:t>
             </w:r>
           </w:p>
           <w:p>
@@ -4011,8 +3957,7 @@
               <w:t xml:space="preserve">Archive Digitisation: </w:t>
             </w:r>
             <w:r>
-              <w:rPr/>
-              <w:t xml:space="preserve">Assist archives and libraries in reading and indexing handwritten Modi documents.</w:t>
+              <w:t>Assist archives and libraries in reading and indexing handwritten Modi documents.</w:t>
             </w:r>
           </w:p>
           <w:p>
@@ -4034,8 +3979,7 @@
               <w:t xml:space="preserve">Historical Research: </w:t>
             </w:r>
             <w:r>
-              <w:rPr/>
-              <w:t xml:space="preserve">Help historians read land records, court documents and correspondence.</w:t>
+              <w:t>Help historians read land records, court documents and correspondence.</w:t>
             </w:r>
           </w:p>
           <w:p>
@@ -4057,8 +4001,7 @@
               <w:t xml:space="preserve">Education: </w:t>
             </w:r>
             <w:r>
-              <w:rPr/>
-              <w:t xml:space="preserve">Serve as an interactive learning aid for students of the Modi script.</w:t>
+              <w:t>Serve as an interactive learning aid for students of the Modi script.</w:t>
             </w:r>
           </w:p>
           <w:p>
@@ -4080,8 +4023,7 @@
               <w:t xml:space="preserve">Assisted Transcription: </w:t>
             </w:r>
             <w:r>
-              <w:rPr/>
-              <w:t xml:space="preserve">Provide character-level suggestions with confidence scores for expert verification.</w:t>
+              <w:t>Provide character-level suggestions with confidence scores for expert verification.</w:t>
             </w:r>
           </w:p>
           <w:p>
@@ -4103,8 +4045,7 @@
               <w:t xml:space="preserve">Explainable AI Demonstration: </w:t>
             </w:r>
             <w:r>
-              <w:rPr/>
-              <w:t xml:space="preserve">Show how handcrafted features and ensemble models reach their decisions.</w:t>
+              <w:t>Show how handcrafted features and ensemble models reach their decisions.</w:t>
             </w:r>
           </w:p>
           <w:p>
@@ -4125,7 +4066,7 @@
                 <w:sz w:val="24"/>
                 <w:szCs w:val="24"/>
               </w:rPr>
-              <w:t xml:space="preserve">Future Scope</w:t>
+              <w:t>Future Scope</w:t>
             </w:r>
           </w:p>
           <w:p>
@@ -4139,8 +4080,7 @@
               <w:jc w:val="both"/>
             </w:pPr>
             <w:r>
-              <w:rPr/>
-              <w:t xml:space="preserve">Reliable segmentation of continuous cursive manuscripts, including touching characters.</w:t>
+              <w:t>Reliable segmentation of continuous cursive manuscripts, including touching characters.</w:t>
             </w:r>
           </w:p>
           <w:p>
@@ -4154,8 +4094,7 @@
               <w:jc w:val="both"/>
             </w:pPr>
             <w:r>
-              <w:rPr/>
-              <w:t xml:space="preserve">Word-level and line-level recognition with transliteration into Devanagari.</w:t>
+              <w:t>Word-level and line-level recognition with transliteration into Devanagari.</w:t>
             </w:r>
           </w:p>
           <w:p>
@@ -4169,8 +4108,7 @@
               <w:jc w:val="both"/>
             </w:pPr>
             <w:r>
-              <w:rPr/>
-              <w:t xml:space="preserve">Recognition of vowel signs (matras) and conjunct characters beyond the 57 base classes.</w:t>
+              <w:t>Recognition of vowel signs (matras) and conjunct characters beyond the 57 base classes.</w:t>
             </w:r>
           </w:p>
           <w:p>
@@ -4184,8 +4122,7 @@
               <w:jc w:val="both"/>
             </w:pPr>
             <w:r>
-              <w:rPr/>
-              <w:t xml:space="preserve">Training on more writers and historical eras to improve generalisation.</w:t>
+              <w:t>Training on more writers and historical eras to improve generalisation.</w:t>
             </w:r>
           </w:p>
           <w:p>
@@ -4199,8 +4136,7 @@
               <w:jc w:val="both"/>
             </w:pPr>
             <w:r>
-              <w:rPr/>
-              <w:t xml:space="preserve">Hybrid models that combine handcrafted features with learned features.</w:t>
+              <w:t>Hybrid models that combine handcrafted features with learned features.</w:t>
             </w:r>
           </w:p>
           <w:p>
@@ -4214,8 +4150,7 @@
               <w:jc w:val="both"/>
             </w:pPr>
             <w:r>
-              <w:rPr/>
-              <w:t xml:space="preserve">A mobile application for on-site use in archives.</w:t>
+              <w:t>A mobile application for on-site use in archives.</w:t>
             </w:r>
           </w:p>
           <w:p>
@@ -4237,14 +4172,32 @@
       <w:r>
         <w:lastRenderedPageBreak/>
         <w:t xml:space="preserve">            </w:t>
+      </w:r>
+      <w:r>
         <w:tab/>
+      </w:r>
+      <w:r>
         <w:tab/>
+      </w:r>
+      <w:r>
         <w:tab/>
+      </w:r>
+      <w:r>
         <w:tab/>
+      </w:r>
+      <w:r>
         <w:tab/>
+      </w:r>
+      <w:r>
         <w:tab/>
+      </w:r>
+      <w:r>
         <w:tab/>
+      </w:r>
+      <w:r>
         <w:tab/>
+      </w:r>
+      <w:r>
         <w:tab/>
       </w:r>
     </w:p>
@@ -4263,7 +4216,6 @@
         <w:ind w:hanging="1080"/>
       </w:pPr>
       <w:r>
-        <w:lastRenderedPageBreak/>
         <w:t xml:space="preserve">   </w:t>
       </w:r>
     </w:p>
@@ -4276,6 +4228,8 @@
       </w:pPr>
       <w:r>
         <w:tab/>
+      </w:r>
+      <w:r>
         <w:tab/>
         <w:t xml:space="preserve">      </w:t>
       </w:r>
@@ -4369,7 +4323,7 @@
                 <w:sz w:val="20"/>
                 <w:szCs w:val="20"/>
               </w:rPr>
-              <w:t xml:space="preserve">TY-A2</w:t>
+              <w:t>TY-A2</w:t>
             </w:r>
           </w:p>
         </w:tc>
@@ -4737,12 +4691,7 @@
     <w:p>
       <w:r>
         <w:br/>
-        <w:t xml:space="preserve">        </w:t>
-      </w:r>
-      <w:bookmarkStart w:id="0" w:name="_GoBack"/>
-      <w:bookmarkEnd w:id="0"/>
-      <w:r>
-        <w:t xml:space="preserve">Format of Progress Review Report: </w:t>
+        <w:t xml:space="preserve">        Format of Progress Review Report: </w:t>
       </w:r>
     </w:p>
     <w:p/>
@@ -4783,7 +4732,7 @@
                 <w:sz w:val="22"/>
                 <w:szCs w:val="22"/>
               </w:rPr>
-              <w:t xml:space="preserve">Review No.: 1                                  Group No.:     TY-A2                            Date:</w:t>
+              <w:t>Review No.: 1                                  Group No.:     TY-A2                            Date:</w:t>
             </w:r>
           </w:p>
           <w:p>
@@ -5072,7 +5021,7 @@
                 <w:sz w:val="22"/>
                 <w:szCs w:val="22"/>
               </w:rPr>
-              <w:t xml:space="preserve">Review No.: 2                                  Group No.:  TY-A2                              Date:</w:t>
+              <w:t>Review No.: 2                                  Group No.:  TY-A2                              Date:</w:t>
             </w:r>
           </w:p>
           <w:p>
@@ -5433,7 +5382,7 @@
 </file>
 
 <file path=word/endnotes.xml><?xml version="1.0" encoding="utf-8"?>
-<w:endnotes xmlns:wpc="http://schemas.microsoft.com/office/word/2010/wordprocessingCanvas" xmlns:mc="http://schemas.openxmlformats.org/markup-compatibility/2006" xmlns:o="urn:schemas-microsoft-com:office:office" xmlns:r="http://schemas.openxmlformats.org/officeDocument/2006/relationships" xmlns:m="http://schemas.openxmlformats.org/officeDocument/2006/math" xmlns:v="urn:schemas-microsoft-com:vml" xmlns:wp14="http://schemas.microsoft.com/office/word/2010/wordprocessingDrawing" xmlns:wp="http://schemas.openxmlformats.org/drawingml/2006/wordprocessingDrawing" xmlns:w10="urn:schemas-microsoft-com:office:word" xmlns:w="http://schemas.openxmlformats.org/wordprocessingml/2006/main" xmlns:w14="http://schemas.microsoft.com/office/word/2010/wordml" xmlns:w15="http://schemas.microsoft.com/office/word/2012/wordml" xmlns:wpg="http://schemas.microsoft.com/office/word/2010/wordprocessingGroup" xmlns:wpi="http://schemas.microsoft.com/office/word/2010/wordprocessingInk" xmlns:wne="http://schemas.microsoft.com/office/word/2006/wordml" xmlns:wps="http://schemas.microsoft.com/office/word/2010/wordprocessingShape" mc:Ignorable="w14 w15 wp14">
+<w:endnotes xmlns:wpc="http://schemas.microsoft.com/office/word/2010/wordprocessingCanvas" xmlns:cx="http://schemas.microsoft.com/office/drawing/2014/chartex" xmlns:cx1="http://schemas.microsoft.com/office/drawing/2015/9/8/chartex" xmlns:cx2="http://schemas.microsoft.com/office/drawing/2015/10/21/chartex" xmlns:cx3="http://schemas.microsoft.com/office/drawing/2016/5/9/chartex" xmlns:cx4="http://schemas.microsoft.com/office/drawing/2016/5/10/chartex" xmlns:cx5="http://schemas.microsoft.com/office/drawing/2016/5/11/chartex" xmlns:cx6="http://schemas.microsoft.com/office/drawing/2016/5/12/chartex" xmlns:cx7="http://schemas.microsoft.com/office/drawing/2016/5/13/chartex" xmlns:cx8="http://schemas.microsoft.com/office/drawing/2016/5/14/chartex" xmlns:mc="http://schemas.openxmlformats.org/markup-compatibility/2006" xmlns:aink="http://schemas.microsoft.com/office/drawing/2016/ink" xmlns:am3d="http://schemas.microsoft.com/office/drawing/2017/model3d" xmlns:o="urn:schemas-microsoft-com:office:office" xmlns:oel="http://schemas.microsoft.com/office/2019/extlst" xmlns:r="http://schemas.openxmlformats.org/officeDocument/2006/relationships" xmlns:m="http://schemas.openxmlformats.org/officeDocument/2006/math" xmlns:v="urn:schemas-microsoft-com:vml" xmlns:wp14="http://schemas.microsoft.com/office/word/2010/wordprocessingDrawing" xmlns:wp="http://schemas.openxmlformats.org/drawingml/2006/wordprocessingDrawing" xmlns:w10="urn:schemas-microsoft-com:office:word" xmlns:w="http://schemas.openxmlformats.org/wordprocessingml/2006/main" xmlns:w14="http://schemas.microsoft.com/office/word/2010/wordml" xmlns:w15="http://schemas.microsoft.com/office/word/2012/wordml" xmlns:w16cex="http://schemas.microsoft.com/office/word/2018/wordml/cex" xmlns:w16cid="http://schemas.microsoft.com/office/word/2016/wordml/cid" xmlns:w16="http://schemas.microsoft.com/office/word/2018/wordml" xmlns:w16du="http://schemas.microsoft.com/office/word/2023/wordml/word16du" xmlns:w16sdtdh="http://schemas.microsoft.com/office/word/2020/wordml/sdtdatahash" xmlns:w16sdtfl="http://schemas.microsoft.com/office/word/2024/wordml/sdtformatlock" xmlns:w16se="http://schemas.microsoft.com/office/word/2015/wordml/symex" xmlns:wpg="http://schemas.microsoft.com/office/word/2010/wordprocessingGroup" xmlns:wpi="http://schemas.microsoft.com/office/word/2010/wordprocessingInk" xmlns:wne="http://schemas.microsoft.com/office/word/2006/wordml" xmlns:wps="http://schemas.microsoft.com/office/word/2010/wordprocessingShape" mc:Ignorable="w14 w15 w16se w16cid w16 w16cex w16sdtdh w16sdtfl w16du wp14">
   <w:endnote w:type="separator" w:id="-1">
     <w:p>
       <w:r>
@@ -5452,7 +5401,7 @@
 </file>
 
 <file path=word/footer1.xml><?xml version="1.0" encoding="utf-8"?>
-<w:ftr xmlns:wpc="http://schemas.microsoft.com/office/word/2010/wordprocessingCanvas" xmlns:mc="http://schemas.openxmlformats.org/markup-compatibility/2006" xmlns:o="urn:schemas-microsoft-com:office:office" xmlns:r="http://schemas.openxmlformats.org/officeDocument/2006/relationships" xmlns:m="http://schemas.openxmlformats.org/officeDocument/2006/math" xmlns:v="urn:schemas-microsoft-com:vml" xmlns:wp14="http://schemas.microsoft.com/office/word/2010/wordprocessingDrawing" xmlns:wp="http://schemas.openxmlformats.org/drawingml/2006/wordprocessingDrawing" xmlns:w10="urn:schemas-microsoft-com:office:word" xmlns:w="http://schemas.openxmlformats.org/wordprocessingml/2006/main" xmlns:w14="http://schemas.microsoft.com/office/word/2010/wordml" xmlns:w15="http://schemas.microsoft.com/office/word/2012/wordml" xmlns:wpg="http://schemas.microsoft.com/office/word/2010/wordprocessingGroup" xmlns:wpi="http://schemas.microsoft.com/office/word/2010/wordprocessingInk" xmlns:wne="http://schemas.microsoft.com/office/word/2006/wordml" xmlns:wps="http://schemas.microsoft.com/office/word/2010/wordprocessingShape" mc:Ignorable="w14 w15 wp14">
+<w:ftr xmlns:wpc="http://schemas.microsoft.com/office/word/2010/wordprocessingCanvas" xmlns:cx="http://schemas.microsoft.com/office/drawing/2014/chartex" xmlns:cx1="http://schemas.microsoft.com/office/drawing/2015/9/8/chartex" xmlns:cx2="http://schemas.microsoft.com/office/drawing/2015/10/21/chartex" xmlns:cx3="http://schemas.microsoft.com/office/drawing/2016/5/9/chartex" xmlns:cx4="http://schemas.microsoft.com/office/drawing/2016/5/10/chartex" xmlns:cx5="http://schemas.microsoft.com/office/drawing/2016/5/11/chartex" xmlns:cx6="http://schemas.microsoft.com/office/drawing/2016/5/12/chartex" xmlns:cx7="http://schemas.microsoft.com/office/drawing/2016/5/13/chartex" xmlns:cx8="http://schemas.microsoft.com/office/drawing/2016/5/14/chartex" xmlns:mc="http://schemas.openxmlformats.org/markup-compatibility/2006" xmlns:aink="http://schemas.microsoft.com/office/drawing/2016/ink" xmlns:am3d="http://schemas.microsoft.com/office/drawing/2017/model3d" xmlns:o="urn:schemas-microsoft-com:office:office" xmlns:oel="http://schemas.microsoft.com/office/2019/extlst" xmlns:r="http://schemas.openxmlformats.org/officeDocument/2006/relationships" xmlns:m="http://schemas.openxmlformats.org/officeDocument/2006/math" xmlns:v="urn:schemas-microsoft-com:vml" xmlns:wp14="http://schemas.microsoft.com/office/word/2010/wordprocessingDrawing" xmlns:wp="http://schemas.openxmlformats.org/drawingml/2006/wordprocessingDrawing" xmlns:w10="urn:schemas-microsoft-com:office:word" xmlns:w="http://schemas.openxmlformats.org/wordprocessingml/2006/main" xmlns:w14="http://schemas.microsoft.com/office/word/2010/wordml" xmlns:w15="http://schemas.microsoft.com/office/word/2012/wordml" xmlns:w16cex="http://schemas.microsoft.com/office/word/2018/wordml/cex" xmlns:w16cid="http://schemas.microsoft.com/office/word/2016/wordml/cid" xmlns:w16="http://schemas.microsoft.com/office/word/2018/wordml" xmlns:w16du="http://schemas.microsoft.com/office/word/2023/wordml/word16du" xmlns:w16sdtdh="http://schemas.microsoft.com/office/word/2020/wordml/sdtdatahash" xmlns:w16sdtfl="http://schemas.microsoft.com/office/word/2024/wordml/sdtformatlock" xmlns:w16se="http://schemas.microsoft.com/office/word/2015/wordml/symex" xmlns:wpg="http://schemas.microsoft.com/office/word/2010/wordprocessingGroup" xmlns:wpi="http://schemas.microsoft.com/office/word/2010/wordprocessingInk" xmlns:wne="http://schemas.microsoft.com/office/word/2006/wordml" xmlns:wps="http://schemas.microsoft.com/office/word/2010/wordprocessingShape" mc:Ignorable="w14 w15 w16se w16cid w16 w16cex w16sdtdh w16sdtfl w16du wp14">
   <w:p>
     <w:pPr>
       <w:pStyle w:val="Footer"/>
@@ -5470,7 +5419,7 @@
 </file>
 
 <file path=word/footnotes.xml><?xml version="1.0" encoding="utf-8"?>
-<w:footnotes xmlns:wpc="http://schemas.microsoft.com/office/word/2010/wordprocessingCanvas" xmlns:mc="http://schemas.openxmlformats.org/markup-compatibility/2006" xmlns:o="urn:schemas-microsoft-com:office:office" xmlns:r="http://schemas.openxmlformats.org/officeDocument/2006/relationships" xmlns:m="http://schemas.openxmlformats.org/officeDocument/2006/math" xmlns:v="urn:schemas-microsoft-com:vml" xmlns:wp14="http://schemas.microsoft.com/office/word/2010/wordprocessingDrawing" xmlns:wp="http://schemas.openxmlformats.org/drawingml/2006/wordprocessingDrawing" xmlns:w10="urn:schemas-microsoft-com:office:word" xmlns:w="http://schemas.openxmlformats.org/wordprocessingml/2006/main" xmlns:w14="http://schemas.microsoft.com/office/word/2010/wordml" xmlns:w15="http://schemas.microsoft.com/office/word/2012/wordml" xmlns:wpg="http://schemas.microsoft.com/office/word/2010/wordprocessingGroup" xmlns:wpi="http://schemas.microsoft.com/office/word/2010/wordprocessingInk" xmlns:wne="http://schemas.microsoft.com/office/word/2006/wordml" xmlns:wps="http://schemas.microsoft.com/office/word/2010/wordprocessingShape" mc:Ignorable="w14 w15 wp14">
+<w:footnotes xmlns:wpc="http://schemas.microsoft.com/office/word/2010/wordprocessingCanvas" xmlns:cx="http://schemas.microsoft.com/office/drawing/2014/chartex" xmlns:cx1="http://schemas.microsoft.com/office/drawing/2015/9/8/chartex" xmlns:cx2="http://schemas.microsoft.com/office/drawing/2015/10/21/chartex" xmlns:cx3="http://schemas.microsoft.com/office/drawing/2016/5/9/chartex" xmlns:cx4="http://schemas.microsoft.com/office/drawing/2016/5/10/chartex" xmlns:cx5="http://schemas.microsoft.com/office/drawing/2016/5/11/chartex" xmlns:cx6="http://schemas.microsoft.com/office/drawing/2016/5/12/chartex" xmlns:cx7="http://schemas.microsoft.com/office/drawing/2016/5/13/chartex" xmlns:cx8="http://schemas.microsoft.com/office/drawing/2016/5/14/chartex" xmlns:mc="http://schemas.openxmlformats.org/markup-compatibility/2006" xmlns:aink="http://schemas.microsoft.com/office/drawing/2016/ink" xmlns:am3d="http://schemas.microsoft.com/office/drawing/2017/model3d" xmlns:o="urn:schemas-microsoft-com:office:office" xmlns:oel="http://schemas.microsoft.com/office/2019/extlst" xmlns:r="http://schemas.openxmlformats.org/officeDocument/2006/relationships" xmlns:m="http://schemas.openxmlformats.org/officeDocument/2006/math" xmlns:v="urn:schemas-microsoft-com:vml" xmlns:wp14="http://schemas.microsoft.com/office/word/2010/wordprocessingDrawing" xmlns:wp="http://schemas.openxmlformats.org/drawingml/2006/wordprocessingDrawing" xmlns:w10="urn:schemas-microsoft-com:office:word" xmlns:w="http://schemas.openxmlformats.org/wordprocessingml/2006/main" xmlns:w14="http://schemas.microsoft.com/office/word/2010/wordml" xmlns:w15="http://schemas.microsoft.com/office/word/2012/wordml" xmlns:w16cex="http://schemas.microsoft.com/office/word/2018/wordml/cex" xmlns:w16cid="http://schemas.microsoft.com/office/word/2016/wordml/cid" xmlns:w16="http://schemas.microsoft.com/office/word/2018/wordml" xmlns:w16du="http://schemas.microsoft.com/office/word/2023/wordml/word16du" xmlns:w16sdtdh="http://schemas.microsoft.com/office/word/2020/wordml/sdtdatahash" xmlns:w16sdtfl="http://schemas.microsoft.com/office/word/2024/wordml/sdtformatlock" xmlns:w16se="http://schemas.microsoft.com/office/word/2015/wordml/symex" xmlns:wpg="http://schemas.microsoft.com/office/word/2010/wordprocessingGroup" xmlns:wpi="http://schemas.microsoft.com/office/word/2010/wordprocessingInk" xmlns:wne="http://schemas.microsoft.com/office/word/2006/wordml" xmlns:wps="http://schemas.microsoft.com/office/word/2010/wordprocessingShape" mc:Ignorable="w14 w15 w16se w16cid w16 w16cex w16sdtdh w16sdtfl w16du wp14">
   <w:footnote w:type="separator" w:id="-1">
     <w:p>
       <w:r>
@@ -5489,7 +5438,7 @@
 </file>
 
 <file path=word/header1.xml><?xml version="1.0" encoding="utf-8"?>
-<w:hdr xmlns:wpc="http://schemas.microsoft.com/office/word/2010/wordprocessingCanvas" xmlns:mc="http://schemas.openxmlformats.org/markup-compatibility/2006" xmlns:o="urn:schemas-microsoft-com:office:office" xmlns:r="http://schemas.openxmlformats.org/officeDocument/2006/relationships" xmlns:m="http://schemas.openxmlformats.org/officeDocument/2006/math" xmlns:v="urn:schemas-microsoft-com:vml" xmlns:wp14="http://schemas.microsoft.com/office/word/2010/wordprocessingDrawing" xmlns:wp="http://schemas.openxmlformats.org/drawingml/2006/wordprocessingDrawing" xmlns:w10="urn:schemas-microsoft-com:office:word" xmlns:w="http://schemas.openxmlformats.org/wordprocessingml/2006/main" xmlns:w14="http://schemas.microsoft.com/office/word/2010/wordml" xmlns:w15="http://schemas.microsoft.com/office/word/2012/wordml" xmlns:wpg="http://schemas.microsoft.com/office/word/2010/wordprocessingGroup" xmlns:wpi="http://schemas.microsoft.com/office/word/2010/wordprocessingInk" xmlns:wne="http://schemas.microsoft.com/office/word/2006/wordml" xmlns:wps="http://schemas.microsoft.com/office/word/2010/wordprocessingShape" mc:Ignorable="w14 w15 wp14">
+<w:hdr xmlns:wpc="http://schemas.microsoft.com/office/word/2010/wordprocessingCanvas" xmlns:cx="http://schemas.microsoft.com/office/drawing/2014/chartex" xmlns:cx1="http://schemas.microsoft.com/office/drawing/2015/9/8/chartex" xmlns:cx2="http://schemas.microsoft.com/office/drawing/2015/10/21/chartex" xmlns:cx3="http://schemas.microsoft.com/office/drawing/2016/5/9/chartex" xmlns:cx4="http://schemas.microsoft.com/office/drawing/2016/5/10/chartex" xmlns:cx5="http://schemas.microsoft.com/office/drawing/2016/5/11/chartex" xmlns:cx6="http://schemas.microsoft.com/office/drawing/2016/5/12/chartex" xmlns:cx7="http://schemas.microsoft.com/office/drawing/2016/5/13/chartex" xmlns:cx8="http://schemas.microsoft.com/office/drawing/2016/5/14/chartex" xmlns:mc="http://schemas.openxmlformats.org/markup-compatibility/2006" xmlns:aink="http://schemas.microsoft.com/office/drawing/2016/ink" xmlns:am3d="http://schemas.microsoft.com/office/drawing/2017/model3d" xmlns:o="urn:schemas-microsoft-com:office:office" xmlns:oel="http://schemas.microsoft.com/office/2019/extlst" xmlns:r="http://schemas.openxmlformats.org/officeDocument/2006/relationships" xmlns:m="http://schemas.openxmlformats.org/officeDocument/2006/math" xmlns:v="urn:schemas-microsoft-com:vml" xmlns:wp14="http://schemas.microsoft.com/office/word/2010/wordprocessingDrawing" xmlns:wp="http://schemas.openxmlformats.org/drawingml/2006/wordprocessingDrawing" xmlns:w10="urn:schemas-microsoft-com:office:word" xmlns:w="http://schemas.openxmlformats.org/wordprocessingml/2006/main" xmlns:w14="http://schemas.microsoft.com/office/word/2010/wordml" xmlns:w15="http://schemas.microsoft.com/office/word/2012/wordml" xmlns:w16cex="http://schemas.microsoft.com/office/word/2018/wordml/cex" xmlns:w16cid="http://schemas.microsoft.com/office/word/2016/wordml/cid" xmlns:w16="http://schemas.microsoft.com/office/word/2018/wordml" xmlns:w16du="http://schemas.microsoft.com/office/word/2023/wordml/word16du" xmlns:w16sdtdh="http://schemas.microsoft.com/office/word/2020/wordml/sdtdatahash" xmlns:w16sdtfl="http://schemas.microsoft.com/office/word/2024/wordml/sdtformatlock" xmlns:w16se="http://schemas.microsoft.com/office/word/2015/wordml/symex" xmlns:wpg="http://schemas.microsoft.com/office/word/2010/wordprocessingGroup" xmlns:wpi="http://schemas.microsoft.com/office/word/2010/wordprocessingInk" xmlns:wne="http://schemas.microsoft.com/office/word/2006/wordml" xmlns:wps="http://schemas.microsoft.com/office/word/2010/wordprocessingShape" mc:Ignorable="w14 w15 w16se w16cid w16 w16cex w16sdtdh w16sdtfl w16du wp14">
   <w:p>
     <w:pPr>
       <w:pStyle w:val="Header"/>
@@ -5498,7 +5447,7 @@
       <w:rPr>
         <w:noProof/>
       </w:rPr>
-      <w:pict>
+      <w:pict w14:anchorId="28888F0E">
         <v:shapetype id="_x0000_t75" coordsize="21600,21600" o:spt="75" o:preferrelative="t" path="m@4@5l@4@11@9@11@9@5xe" filled="f" stroked="f">
           <v:stroke joinstyle="miter"/>
           <v:formulas>
@@ -5518,7 +5467,7 @@
           <v:path o:extrusionok="f" gradientshapeok="t" o:connecttype="rect"/>
           <o:lock v:ext="edit" aspectratio="t"/>
         </v:shapetype>
-        <v:shape id="WordPictureWatermark25830016" o:spid="_x0000_s2049" type="#_x0000_t75" alt="" style="position:absolute;margin-left:0;margin-top:0;width:544.95pt;height:315.65pt;z-index:-251658240;mso-wrap-edited:f;mso-width-percent:0;mso-height-percent:0;mso-position-horizontal:center;mso-position-horizontal-relative:margin;mso-position-vertical:center;mso-position-vertical-relative:margin;mso-width-percent:0;mso-height-percent:0" o:allowincell="f">
+        <v:shape id="WordPictureWatermark25830016" o:spid="_x0000_s1025" type="#_x0000_t75" alt="" style="position:absolute;margin-left:0;margin-top:0;width:544.95pt;height:315.65pt;z-index:-251659776;mso-wrap-edited:f;mso-width-percent:0;mso-height-percent:0;mso-position-horizontal:center;mso-position-horizontal-relative:margin;mso-position-vertical:center;mso-position-vertical-relative:margin;mso-width-percent:0;mso-height-percent:0" o:allowincell="f">
           <v:imagedata r:id="rId1" o:title="vit_logo_new" gain="19661f" blacklevel="22938f"/>
           <w10:wrap anchorx="margin" anchory="margin"/>
         </v:shape>
@@ -5529,7 +5478,7 @@
 </file>
 
 <file path=word/header2.xml><?xml version="1.0" encoding="utf-8"?>
-<w:hdr xmlns:wpc="http://schemas.microsoft.com/office/word/2010/wordprocessingCanvas" xmlns:mc="http://schemas.openxmlformats.org/markup-compatibility/2006" xmlns:o="urn:schemas-microsoft-com:office:office" xmlns:r="http://schemas.openxmlformats.org/officeDocument/2006/relationships" xmlns:m="http://schemas.openxmlformats.org/officeDocument/2006/math" xmlns:v="urn:schemas-microsoft-com:vml" xmlns:wp14="http://schemas.microsoft.com/office/word/2010/wordprocessingDrawing" xmlns:wp="http://schemas.openxmlformats.org/drawingml/2006/wordprocessingDrawing" xmlns:w10="urn:schemas-microsoft-com:office:word" xmlns:w="http://schemas.openxmlformats.org/wordprocessingml/2006/main" xmlns:w14="http://schemas.microsoft.com/office/word/2010/wordml" xmlns:w15="http://schemas.microsoft.com/office/word/2012/wordml" xmlns:wpg="http://schemas.microsoft.com/office/word/2010/wordprocessingGroup" xmlns:wpi="http://schemas.microsoft.com/office/word/2010/wordprocessingInk" xmlns:wne="http://schemas.microsoft.com/office/word/2006/wordml" xmlns:wps="http://schemas.microsoft.com/office/word/2010/wordprocessingShape" mc:Ignorable="w14 w15 wp14">
+<w:hdr xmlns:wpc="http://schemas.microsoft.com/office/word/2010/wordprocessingCanvas" xmlns:cx="http://schemas.microsoft.com/office/drawing/2014/chartex" xmlns:cx1="http://schemas.microsoft.com/office/drawing/2015/9/8/chartex" xmlns:cx2="http://schemas.microsoft.com/office/drawing/2015/10/21/chartex" xmlns:cx3="http://schemas.microsoft.com/office/drawing/2016/5/9/chartex" xmlns:cx4="http://schemas.microsoft.com/office/drawing/2016/5/10/chartex" xmlns:cx5="http://schemas.microsoft.com/office/drawing/2016/5/11/chartex" xmlns:cx6="http://schemas.microsoft.com/office/drawing/2016/5/12/chartex" xmlns:cx7="http://schemas.microsoft.com/office/drawing/2016/5/13/chartex" xmlns:cx8="http://schemas.microsoft.com/office/drawing/2016/5/14/chartex" xmlns:mc="http://schemas.openxmlformats.org/markup-compatibility/2006" xmlns:aink="http://schemas.microsoft.com/office/drawing/2016/ink" xmlns:am3d="http://schemas.microsoft.com/office/drawing/2017/model3d" xmlns:o="urn:schemas-microsoft-com:office:office" xmlns:oel="http://schemas.microsoft.com/office/2019/extlst" xmlns:r="http://schemas.openxmlformats.org/officeDocument/2006/relationships" xmlns:m="http://schemas.openxmlformats.org/officeDocument/2006/math" xmlns:v="urn:schemas-microsoft-com:vml" xmlns:wp14="http://schemas.microsoft.com/office/word/2010/wordprocessingDrawing" xmlns:wp="http://schemas.openxmlformats.org/drawingml/2006/wordprocessingDrawing" xmlns:w10="urn:schemas-microsoft-com:office:word" xmlns:w="http://schemas.openxmlformats.org/wordprocessingml/2006/main" xmlns:w14="http://schemas.microsoft.com/office/word/2010/wordml" xmlns:w15="http://schemas.microsoft.com/office/word/2012/wordml" xmlns:w16cex="http://schemas.microsoft.com/office/word/2018/wordml/cex" xmlns:w16cid="http://schemas.microsoft.com/office/word/2016/wordml/cid" xmlns:w16="http://schemas.microsoft.com/office/word/2018/wordml" xmlns:w16du="http://schemas.microsoft.com/office/word/2023/wordml/word16du" xmlns:w16sdtdh="http://schemas.microsoft.com/office/word/2020/wordml/sdtdatahash" xmlns:w16sdtfl="http://schemas.microsoft.com/office/word/2024/wordml/sdtformatlock" xmlns:w16se="http://schemas.microsoft.com/office/word/2015/wordml/symex" xmlns:wpg="http://schemas.microsoft.com/office/word/2010/wordprocessingGroup" xmlns:wpi="http://schemas.microsoft.com/office/word/2010/wordprocessingInk" xmlns:wne="http://schemas.microsoft.com/office/word/2006/wordml" xmlns:wps="http://schemas.microsoft.com/office/word/2010/wordprocessingShape" mc:Ignorable="w14 w15 w16se w16cid w16 w16cex w16sdtdh w16sdtfl w16du wp14">
   <w:p>
     <w:pPr>
       <w:jc w:val="center"/>
@@ -5538,7 +5487,6 @@
         <w:u w:val="single"/>
       </w:rPr>
     </w:pPr>
-    <w:proofErr w:type="spellStart"/>
     <w:r>
       <w:rPr>
         <w:b/>
@@ -5546,17 +5494,7 @@
         <w:szCs w:val="28"/>
         <w:u w:val="single"/>
       </w:rPr>
-      <w:t>Vishwakarma</w:t>
-    </w:r>
-    <w:proofErr w:type="spellEnd"/>
-    <w:r>
-      <w:rPr>
-        <w:b/>
-        <w:sz w:val="28"/>
-        <w:szCs w:val="28"/>
-        <w:u w:val="single"/>
-      </w:rPr>
-      <w:t xml:space="preserve"> Institute of Technology   </w:t>
+      <w:t xml:space="preserve">Vishwakarma Institute of Technology   </w:t>
     </w:r>
     <w:r>
       <w:rPr>
@@ -5575,25 +5513,7 @@
         <w:bCs/>
         <w:u w:val="single"/>
       </w:rPr>
-      <w:t xml:space="preserve">Issue </w:t>
-    </w:r>
-    <w:proofErr w:type="gramStart"/>
-    <w:r>
-      <w:rPr>
-        <w:b/>
-        <w:bCs/>
-        <w:u w:val="single"/>
-      </w:rPr>
-      <w:t>01 :</w:t>
-    </w:r>
-    <w:proofErr w:type="gramEnd"/>
-    <w:r>
-      <w:rPr>
-        <w:b/>
-        <w:bCs/>
-        <w:u w:val="single"/>
-      </w:rPr>
-      <w:t xml:space="preserve"> Rev No. 00 : Dt. </w:t>
+      <w:t xml:space="preserve">Issue 01 : Rev No. 00 : Dt. </w:t>
     </w:r>
     <w:r>
       <w:rPr>
@@ -5613,7 +5533,7 @@
       </w:rPr>
     </w:pPr>
     <w:r>
-      <w:pict>
+      <w:pict w14:anchorId="19E4D691">
         <v:shapetype id="_x0000_t75" coordsize="21600,21600" o:spt="75" o:preferrelative="t" path="m@4@5l@4@11@9@11@9@5xe" filled="f" stroked="f">
           <v:stroke joinstyle="miter"/>
           <v:formulas>
@@ -5633,7 +5553,7 @@
           <v:path o:extrusionok="f" gradientshapeok="t" o:connecttype="rect"/>
           <o:lock v:ext="edit" aspectratio="t"/>
         </v:shapetype>
-        <v:shape id="WordPictureWatermark21864736" o:spid="_x0000_s2051" type="#_x0000_t75" alt="" style="position:absolute;left:0;text-align:left;margin-left:46.9pt;margin-top:201.35pt;width:451.25pt;height:261.4pt;z-index:-251658240;mso-wrap-edited:f;mso-width-percent:0;mso-height-percent:0;mso-position-horizontal-relative:margin;mso-position-vertical-relative:margin;mso-width-percent:0;mso-height-percent:0" o:allowincell="f">
+        <v:shape id="WordPictureWatermark21864736" o:spid="_x0000_s1027" type="#_x0000_t75" alt="" style="position:absolute;left:0;text-align:left;margin-left:46.9pt;margin-top:201.35pt;width:451.25pt;height:261.4pt;z-index:-251658752;mso-wrap-edited:f;mso-width-percent:0;mso-height-percent:0;mso-position-horizontal-relative:margin;mso-position-vertical-relative:margin;mso-width-percent:0;mso-height-percent:0" o:allowincell="f">
           <v:imagedata r:id="rId1" o:title="vit_logo_new" gain="19661f" blacklevel="22938f"/>
           <w10:wrap anchorx="margin" anchory="margin"/>
         </v:shape>
@@ -5644,7 +5564,7 @@
 </file>
 
 <file path=word/header3.xml><?xml version="1.0" encoding="utf-8"?>
-<w:hdr xmlns:wpc="http://schemas.microsoft.com/office/word/2010/wordprocessingCanvas" xmlns:mc="http://schemas.openxmlformats.org/markup-compatibility/2006" xmlns:o="urn:schemas-microsoft-com:office:office" xmlns:r="http://schemas.openxmlformats.org/officeDocument/2006/relationships" xmlns:m="http://schemas.openxmlformats.org/officeDocument/2006/math" xmlns:v="urn:schemas-microsoft-com:vml" xmlns:wp14="http://schemas.microsoft.com/office/word/2010/wordprocessingDrawing" xmlns:wp="http://schemas.openxmlformats.org/drawingml/2006/wordprocessingDrawing" xmlns:w10="urn:schemas-microsoft-com:office:word" xmlns:w="http://schemas.openxmlformats.org/wordprocessingml/2006/main" xmlns:w14="http://schemas.microsoft.com/office/word/2010/wordml" xmlns:w15="http://schemas.microsoft.com/office/word/2012/wordml" xmlns:wpg="http://schemas.microsoft.com/office/word/2010/wordprocessingGroup" xmlns:wpi="http://schemas.microsoft.com/office/word/2010/wordprocessingInk" xmlns:wne="http://schemas.microsoft.com/office/word/2006/wordml" xmlns:wps="http://schemas.microsoft.com/office/word/2010/wordprocessingShape" mc:Ignorable="w14 w15 wp14">
+<w:hdr xmlns:wpc="http://schemas.microsoft.com/office/word/2010/wordprocessingCanvas" xmlns:cx="http://schemas.microsoft.com/office/drawing/2014/chartex" xmlns:cx1="http://schemas.microsoft.com/office/drawing/2015/9/8/chartex" xmlns:cx2="http://schemas.microsoft.com/office/drawing/2015/10/21/chartex" xmlns:cx3="http://schemas.microsoft.com/office/drawing/2016/5/9/chartex" xmlns:cx4="http://schemas.microsoft.com/office/drawing/2016/5/10/chartex" xmlns:cx5="http://schemas.microsoft.com/office/drawing/2016/5/11/chartex" xmlns:cx6="http://schemas.microsoft.com/office/drawing/2016/5/12/chartex" xmlns:cx7="http://schemas.microsoft.com/office/drawing/2016/5/13/chartex" xmlns:cx8="http://schemas.microsoft.com/office/drawing/2016/5/14/chartex" xmlns:mc="http://schemas.openxmlformats.org/markup-compatibility/2006" xmlns:aink="http://schemas.microsoft.com/office/drawing/2016/ink" xmlns:am3d="http://schemas.microsoft.com/office/drawing/2017/model3d" xmlns:o="urn:schemas-microsoft-com:office:office" xmlns:oel="http://schemas.microsoft.com/office/2019/extlst" xmlns:r="http://schemas.openxmlformats.org/officeDocument/2006/relationships" xmlns:m="http://schemas.openxmlformats.org/officeDocument/2006/math" xmlns:v="urn:schemas-microsoft-com:vml" xmlns:wp14="http://schemas.microsoft.com/office/word/2010/wordprocessingDrawing" xmlns:wp="http://schemas.openxmlformats.org/drawingml/2006/wordprocessingDrawing" xmlns:w10="urn:schemas-microsoft-com:office:word" xmlns:w="http://schemas.openxmlformats.org/wordprocessingml/2006/main" xmlns:w14="http://schemas.microsoft.com/office/word/2010/wordml" xmlns:w15="http://schemas.microsoft.com/office/word/2012/wordml" xmlns:w16cex="http://schemas.microsoft.com/office/word/2018/wordml/cex" xmlns:w16cid="http://schemas.microsoft.com/office/word/2016/wordml/cid" xmlns:w16="http://schemas.microsoft.com/office/word/2018/wordml" xmlns:w16du="http://schemas.microsoft.com/office/word/2023/wordml/word16du" xmlns:w16sdtdh="http://schemas.microsoft.com/office/word/2020/wordml/sdtdatahash" xmlns:w16sdtfl="http://schemas.microsoft.com/office/word/2024/wordml/sdtformatlock" xmlns:w16se="http://schemas.microsoft.com/office/word/2015/wordml/symex" xmlns:wpg="http://schemas.microsoft.com/office/word/2010/wordprocessingGroup" xmlns:wpi="http://schemas.microsoft.com/office/word/2010/wordprocessingInk" xmlns:wne="http://schemas.microsoft.com/office/word/2006/wordml" xmlns:wps="http://schemas.microsoft.com/office/word/2010/wordprocessingShape" mc:Ignorable="w14 w15 w16se w16cid w16 w16cex w16sdtdh w16sdtfl w16du wp14">
   <w:p>
     <w:pPr>
       <w:pStyle w:val="Header"/>
@@ -5653,7 +5573,7 @@
       <w:rPr>
         <w:noProof/>
       </w:rPr>
-      <w:pict>
+      <w:pict w14:anchorId="7B084147">
         <v:shapetype id="_x0000_t75" coordsize="21600,21600" o:spt="75" o:preferrelative="t" path="m@4@5l@4@11@9@11@9@5xe" filled="f" stroked="f">
           <v:stroke joinstyle="miter"/>
           <v:formulas>
@@ -5673,7 +5593,7 @@
           <v:path o:extrusionok="f" gradientshapeok="t" o:connecttype="rect"/>
           <o:lock v:ext="edit" aspectratio="t"/>
         </v:shapetype>
-        <v:shape id="WordPictureWatermark25830015" o:spid="_x0000_s2050" type="#_x0000_t75" alt="" style="position:absolute;margin-left:0;margin-top:0;width:544.95pt;height:315.65pt;z-index:-251658240;mso-wrap-edited:f;mso-width-percent:0;mso-height-percent:0;mso-position-horizontal:center;mso-position-horizontal-relative:margin;mso-position-vertical:center;mso-position-vertical-relative:margin;mso-width-percent:0;mso-height-percent:0" o:allowincell="f">
+        <v:shape id="WordPictureWatermark25830015" o:spid="_x0000_s1026" type="#_x0000_t75" alt="" style="position:absolute;margin-left:0;margin-top:0;width:544.95pt;height:315.65pt;z-index:-251657728;mso-wrap-edited:f;mso-width-percent:0;mso-height-percent:0;mso-position-horizontal:center;mso-position-horizontal-relative:margin;mso-position-vertical:center;mso-position-vertical-relative:margin;mso-width-percent:0;mso-height-percent:0" o:allowincell="f">
           <v:imagedata r:id="rId1" o:title="vit_logo_new" gain="19661f" blacklevel="22938f"/>
           <w10:wrap anchorx="margin" anchory="margin"/>
         </v:shape>
@@ -5684,7 +5604,7 @@
 </file>
 
 <file path=word/numbering.xml><?xml version="1.0" encoding="utf-8"?>
-<w:numbering xmlns:wpc="http://schemas.microsoft.com/office/word/2010/wordprocessingCanvas" xmlns:mc="http://schemas.openxmlformats.org/markup-compatibility/2006" xmlns:o="urn:schemas-microsoft-com:office:office" xmlns:r="http://schemas.openxmlformats.org/officeDocument/2006/relationships" xmlns:m="http://schemas.openxmlformats.org/officeDocument/2006/math" xmlns:v="urn:schemas-microsoft-com:vml" xmlns:wp14="http://schemas.microsoft.com/office/word/2010/wordprocessingDrawing" xmlns:wp="http://schemas.openxmlformats.org/drawingml/2006/wordprocessingDrawing" xmlns:w10="urn:schemas-microsoft-com:office:word" xmlns:w="http://schemas.openxmlformats.org/wordprocessingml/2006/main" xmlns:w14="http://schemas.microsoft.com/office/word/2010/wordml" xmlns:w15="http://schemas.microsoft.com/office/word/2012/wordml" xmlns:wpg="http://schemas.microsoft.com/office/word/2010/wordprocessingGroup" xmlns:wpi="http://schemas.microsoft.com/office/word/2010/wordprocessingInk" xmlns:wne="http://schemas.microsoft.com/office/word/2006/wordml" xmlns:wps="http://schemas.microsoft.com/office/word/2010/wordprocessingShape" mc:Ignorable="w14 w15 wp14">
+<w:numbering xmlns:wpc="http://schemas.microsoft.com/office/word/2010/wordprocessingCanvas" xmlns:cx="http://schemas.microsoft.com/office/drawing/2014/chartex" xmlns:cx1="http://schemas.microsoft.com/office/drawing/2015/9/8/chartex" xmlns:cx2="http://schemas.microsoft.com/office/drawing/2015/10/21/chartex" xmlns:cx3="http://schemas.microsoft.com/office/drawing/2016/5/9/chartex" xmlns:cx4="http://schemas.microsoft.com/office/drawing/2016/5/10/chartex" xmlns:cx5="http://schemas.microsoft.com/office/drawing/2016/5/11/chartex" xmlns:cx6="http://schemas.microsoft.com/office/drawing/2016/5/12/chartex" xmlns:cx7="http://schemas.microsoft.com/office/drawing/2016/5/13/chartex" xmlns:cx8="http://schemas.microsoft.com/office/drawing/2016/5/14/chartex" xmlns:mc="http://schemas.openxmlformats.org/markup-compatibility/2006" xmlns:aink="http://schemas.microsoft.com/office/drawing/2016/ink" xmlns:am3d="http://schemas.microsoft.com/office/drawing/2017/model3d" xmlns:o="urn:schemas-microsoft-com:office:office" xmlns:oel="http://schemas.microsoft.com/office/2019/extlst" xmlns:r="http://schemas.openxmlformats.org/officeDocument/2006/relationships" xmlns:m="http://schemas.openxmlformats.org/officeDocument/2006/math" xmlns:v="urn:schemas-microsoft-com:vml" xmlns:wp14="http://schemas.microsoft.com/office/word/2010/wordprocessingDrawing" xmlns:wp="http://schemas.openxmlformats.org/drawingml/2006/wordprocessingDrawing" xmlns:w10="urn:schemas-microsoft-com:office:word" xmlns:w="http://schemas.openxmlformats.org/wordprocessingml/2006/main" xmlns:w14="http://schemas.microsoft.com/office/word/2010/wordml" xmlns:w15="http://schemas.microsoft.com/office/word/2012/wordml" xmlns:w16cex="http://schemas.microsoft.com/office/word/2018/wordml/cex" xmlns:w16cid="http://schemas.microsoft.com/office/word/2016/wordml/cid" xmlns:w16="http://schemas.microsoft.com/office/word/2018/wordml" xmlns:w16du="http://schemas.microsoft.com/office/word/2023/wordml/word16du" xmlns:w16sdtdh="http://schemas.microsoft.com/office/word/2020/wordml/sdtdatahash" xmlns:w16sdtfl="http://schemas.microsoft.com/office/word/2024/wordml/sdtformatlock" xmlns:w16se="http://schemas.microsoft.com/office/word/2015/wordml/symex" xmlns:wpg="http://schemas.microsoft.com/office/word/2010/wordprocessingGroup" xmlns:wpi="http://schemas.microsoft.com/office/word/2010/wordprocessingInk" xmlns:wne="http://schemas.microsoft.com/office/word/2006/wordml" xmlns:wps="http://schemas.microsoft.com/office/word/2010/wordprocessingShape" mc:Ignorable="w14 w15 w16se w16cid w16 w16cex w16sdtdh w16sdtfl w16du wp14">
   <w:abstractNum w:abstractNumId="0" w15:restartNumberingAfterBreak="0">
     <w:nsid w:val="01F12289"/>
     <w:multiLevelType w:val="multilevel"/>
@@ -8842,80 +8762,80 @@
       </w:rPr>
     </w:lvl>
   </w:abstractNum>
-  <w:num w:numId="1">
+  <w:num w:numId="1" w16cid:durableId="483396746">
     <w:abstractNumId w:val="22"/>
   </w:num>
-  <w:num w:numId="2">
+  <w:num w:numId="2" w16cid:durableId="1199777460">
     <w:abstractNumId w:val="21"/>
   </w:num>
-  <w:num w:numId="3">
+  <w:num w:numId="3" w16cid:durableId="270742587">
     <w:abstractNumId w:val="11"/>
   </w:num>
-  <w:num w:numId="4">
+  <w:num w:numId="4" w16cid:durableId="1015301564">
     <w:abstractNumId w:val="12"/>
   </w:num>
-  <w:num w:numId="5">
+  <w:num w:numId="5" w16cid:durableId="2025980875">
     <w:abstractNumId w:val="4"/>
   </w:num>
-  <w:num w:numId="6">
+  <w:num w:numId="6" w16cid:durableId="692146998">
     <w:abstractNumId w:val="1"/>
   </w:num>
-  <w:num w:numId="7">
+  <w:num w:numId="7" w16cid:durableId="1591625591">
     <w:abstractNumId w:val="13"/>
   </w:num>
-  <w:num w:numId="8">
+  <w:num w:numId="8" w16cid:durableId="343291944">
     <w:abstractNumId w:val="2"/>
   </w:num>
-  <w:num w:numId="9">
+  <w:num w:numId="9" w16cid:durableId="346759315">
     <w:abstractNumId w:val="20"/>
   </w:num>
-  <w:num w:numId="10">
+  <w:num w:numId="10" w16cid:durableId="57214455">
     <w:abstractNumId w:val="9"/>
   </w:num>
-  <w:num w:numId="11">
+  <w:num w:numId="11" w16cid:durableId="1016620494">
     <w:abstractNumId w:val="18"/>
   </w:num>
-  <w:num w:numId="12">
+  <w:num w:numId="12" w16cid:durableId="1152598344">
     <w:abstractNumId w:val="0"/>
   </w:num>
-  <w:num w:numId="13">
+  <w:num w:numId="13" w16cid:durableId="757167069">
     <w:abstractNumId w:val="6"/>
   </w:num>
-  <w:num w:numId="14">
+  <w:num w:numId="14" w16cid:durableId="58752408">
     <w:abstractNumId w:val="17"/>
   </w:num>
-  <w:num w:numId="15">
+  <w:num w:numId="15" w16cid:durableId="1695693807">
     <w:abstractNumId w:val="16"/>
   </w:num>
-  <w:num w:numId="16">
+  <w:num w:numId="16" w16cid:durableId="954554422">
     <w:abstractNumId w:val="3"/>
   </w:num>
-  <w:num w:numId="17">
+  <w:num w:numId="17" w16cid:durableId="2064253966">
     <w:abstractNumId w:val="19"/>
   </w:num>
-  <w:num w:numId="18">
+  <w:num w:numId="18" w16cid:durableId="298458836">
     <w:abstractNumId w:val="10"/>
   </w:num>
-  <w:num w:numId="19">
+  <w:num w:numId="19" w16cid:durableId="799110270">
     <w:abstractNumId w:val="7"/>
   </w:num>
-  <w:num w:numId="20">
+  <w:num w:numId="20" w16cid:durableId="1712150548">
     <w:abstractNumId w:val="15"/>
   </w:num>
-  <w:num w:numId="21">
+  <w:num w:numId="21" w16cid:durableId="1490562453">
     <w:abstractNumId w:val="14"/>
   </w:num>
-  <w:num w:numId="22">
+  <w:num w:numId="22" w16cid:durableId="1961758122">
     <w:abstractNumId w:val="5"/>
   </w:num>
-  <w:num w:numId="23">
+  <w:num w:numId="23" w16cid:durableId="1015883234">
     <w:abstractNumId w:val="8"/>
   </w:num>
 </w:numbering>
 </file>
 
 <file path=word/styles.xml><?xml version="1.0" encoding="utf-8"?>
-<w:styles xmlns:mc="http://schemas.openxmlformats.org/markup-compatibility/2006" xmlns:r="http://schemas.openxmlformats.org/officeDocument/2006/relationships" xmlns:w="http://schemas.openxmlformats.org/wordprocessingml/2006/main" xmlns:w14="http://schemas.microsoft.com/office/word/2010/wordml" xmlns:w15="http://schemas.microsoft.com/office/word/2012/wordml" mc:Ignorable="w14 w15">
+<w:styles xmlns:mc="http://schemas.openxmlformats.org/markup-compatibility/2006" xmlns:r="http://schemas.openxmlformats.org/officeDocument/2006/relationships" xmlns:w="http://schemas.openxmlformats.org/wordprocessingml/2006/main" xmlns:w14="http://schemas.microsoft.com/office/word/2010/wordml" xmlns:w15="http://schemas.microsoft.com/office/word/2012/wordml" xmlns:w16cex="http://schemas.microsoft.com/office/word/2018/wordml/cex" xmlns:w16cid="http://schemas.microsoft.com/office/word/2016/wordml/cid" xmlns:w16="http://schemas.microsoft.com/office/word/2018/wordml" xmlns:w16du="http://schemas.microsoft.com/office/word/2023/wordml/word16du" xmlns:w16sdtdh="http://schemas.microsoft.com/office/word/2020/wordml/sdtdatahash" xmlns:w16sdtfl="http://schemas.microsoft.com/office/word/2024/wordml/sdtformatlock" xmlns:w16se="http://schemas.microsoft.com/office/word/2015/wordml/symex" mc:Ignorable="w14 w15 w16se w16cid w16 w16cex w16sdtdh w16sdtfl w16du">
   <w:docDefaults>
     <w:rPrDefault>
       <w:rPr>
@@ -8931,7 +8851,7 @@
       </w:pPr>
     </w:pPrDefault>
   </w:docDefaults>
-  <w:latentStyles w:defLockedState="0" w:defUIPriority="99" w:defSemiHidden="0" w:defUnhideWhenUsed="0" w:defQFormat="0" w:count="371">
+  <w:latentStyles w:defLockedState="0" w:defUIPriority="99" w:defSemiHidden="0" w:defUnhideWhenUsed="0" w:defQFormat="0" w:count="376">
     <w:lsdException w:name="Normal" w:uiPriority="0" w:qFormat="1"/>
     <w:lsdException w:name="heading 1" w:uiPriority="9" w:qFormat="1"/>
     <w:lsdException w:name="heading 2" w:semiHidden="1" w:uiPriority="9" w:unhideWhenUsed="1" w:qFormat="1"/>
@@ -9303,6 +9223,11 @@
     <w:lsdException w:name="List Table 5 Dark Accent 6" w:uiPriority="50"/>
     <w:lsdException w:name="List Table 6 Colorful Accent 6" w:uiPriority="51"/>
     <w:lsdException w:name="List Table 7 Colorful Accent 6" w:uiPriority="52"/>
+    <w:lsdException w:name="Mention" w:semiHidden="1" w:unhideWhenUsed="1"/>
+    <w:lsdException w:name="Smart Hyperlink" w:semiHidden="1" w:unhideWhenUsed="1"/>
+    <w:lsdException w:name="Hashtag" w:semiHidden="1" w:unhideWhenUsed="1"/>
+    <w:lsdException w:name="Unresolved Mention" w:semiHidden="1" w:unhideWhenUsed="1"/>
+    <w:lsdException w:name="Smart Link" w:semiHidden="1" w:unhideWhenUsed="1"/>
   </w:latentStyles>
   <w:style w:type="paragraph" w:default="1" w:styleId="Normal">
     <w:name w:val="Normal"/>
@@ -9339,6 +9264,7 @@
   <w:style w:type="character" w:default="1" w:styleId="DefaultParagraphFont">
     <w:name w:val="Default Paragraph Font"/>
     <w:uiPriority w:val="1"/>
+    <w:semiHidden/>
     <w:unhideWhenUsed/>
   </w:style>
   <w:style w:type="table" w:default="1" w:styleId="TableNormal">

</xml_diff>

<commit_message>
Four objectives from the base papers, simpler synopsis, literature review deck
Synopsis rewritten in plain language with four objectives tied to 7 base papers; the Scope section and extra bullets removed. Base Papers sheet updated to match. Added Literature_Review_Presentation.pptx (18 slides, every paper linked to its PDF on Drive). README now reports the leave-one-out ablation.
</commit_message>
<xml_diff>
--- a/docs/02_synopsis/DS_FF180_g2.docx
+++ b/docs/02_synopsis/DS_FF180_g2.docx
@@ -1656,10 +1656,7 @@
                 <w:b w:val="0"/>
                 <w:bCs w:val="0"/>
               </w:rPr>
-              <w:t xml:space="preserve">Explainable Feature Fusion and Ensemble Learning for Modi Script Recognition: </w:t>
-            </w:r>
-            <w:r>
-              <w:t>is a recognition system for handwritten Modi script. Modi is the cursive script used to write Marathi for about 700 years in land records, court documents and administrative correspondence across Maharashtra. Very few people can read it today, so millions of archived documents are effectively unreadable. The system deliberately uses classical machine learning with handcrafted features instead of deep learning: three complementary descriptors, Histogram of Oriented Gradients (HOG), Zernike moments and Local Binary Patterns (LBP), are fused and classified by Random Forest, SVM (RBF), XGBoost and a stacking ensemble, and every prediction is explained with SHAP. The work is delivered as an interactive web application that recognises the characters in an uploaded image and shows why each decision was made.</w:t>
+              <w:t>Modi is the cursive script that was used to write Marathi for several centuries, mostly for land records, court papers and letters in Maharashtra. Very few people can read it today, so a lot of these documents just sit in archives. In this project we try to recognise single handwritten Modi characters using a computer. Instead of a deep network, we use three hand-made feature types (HOG, Zernike moments and LBP) with classical classifiers like SVM and Random Forest, and we use SHAP to see why the model picked a particular character. We also made a small web app where you can upload or draw a character and check the result.</w:t>
             </w:r>
           </w:p>
           <w:p>
@@ -1705,7 +1702,7 @@
               <w:jc w:val="both"/>
             </w:pPr>
             <w:r>
-              <w:t>Millions of historical Modi documents cannot be read because very few experts remain who know the script. Earlier automatic recognition studies do not solve this reliably: deep-learning studies report 86-98.92% accuracy on a benchmark of only 90 images per class and show clear signs of overfitting, while classical studies report 97.77-99.3% on private datasets of undisclosed size, so their results cannot be verified. None of the surveyed studies explains its predictions or analyses which characters are confused with each other. An accurate, reproducible and explainable recognition system evaluated on a public dataset is therefore needed, together with a measurement of the training-set size at which handcrafted features stop being competitive with deep learning.</w:t>
+              <w:t>Most papers on Modi recognition use deep networks like CNN or VGG16 trained on about 90 images per character, and many of them show signs of overfitting, such as a big gap between training and validation accuracy. The few papers that used classical methods either gave raw pixels to the classifier or tested on very small private datasets. Almost none of them explain their predictions or say which characters get mixed up. So we wanted to check how far handcrafted features can go on a public dataset, and whether we can show why the model makes each decision.</w:t>
             </w:r>
           </w:p>
           <w:p>
@@ -1733,28 +1730,6 @@
               <w:rPr>
                 <w:b/>
               </w:rPr>
-              <w:t>Objective and Scope</w:t>
-            </w:r>
-          </w:p>
-          <w:p>
-            <w:pPr>
-              <w:pStyle w:val="Heading3"/>
-              <w:ind w:left="360"/>
-              <w:jc w:val="both"/>
-              <w:rPr>
-                <w:rStyle w:val="Strong"/>
-                <w:b/>
-                <w:bCs/>
-                <w:sz w:val="24"/>
-                <w:szCs w:val="24"/>
-              </w:rPr>
-            </w:pPr>
-            <w:r>
-              <w:rPr>
-                <w:rStyle w:val="Strong"/>
-                <w:sz w:val="24"/>
-                <w:szCs w:val="24"/>
-              </w:rPr>
               <w:t>Objectives</w:t>
             </w:r>
           </w:p>
@@ -1768,7 +1743,7 @@
               <w:jc w:val="both"/>
             </w:pPr>
             <w:r>
-              <w:t>To recognise all 57 handwritten Modi character classes (12 vowels, 35 consonants and 10 digits) using handcrafted features and classical machine learning instead of a deep network. Most recent papers, such as Bhong and Kulkarni (2025) and Kolte and Gupta (2025), train CNNs on about 90 images per class, and their own numbers show the models overfitting.</w:t>
+              <w:t>To recognise 57 handwritten Modi characters using three handcrafted features, HOG, Zernike moments and LBP, instead of raw pixels. Kulkarni et al. (2014) showed that Zernike moments work for Modi digits, and Mandke et al. (2024) gave raw pixels to SVM and KNN, so we want to see what proper features can do on all the characters.</w:t>
             </w:r>
           </w:p>
           <w:p>
@@ -1781,7 +1756,7 @@
               <w:jc w:val="both"/>
             </w:pPr>
             <w:r>
-              <w:t>To combine three kinds of features, HOG for stroke direction, Zernike moments for overall shape and LBP for small local patterns, and to check through an ablation study how much each one adds. Kulkarni et al. (2014) tried Zernike moments on just 100 digit images, and Mandke et al. (2024) gave their SVM and KNN raw pixels, so a proper fused feature set has not been tried on Modi yet.</w:t>
+              <w:t>To compare Random Forest, SVM and XGBoost on these features and see if combining them with stacking gives better accuracy than the best single one. Ekbote et al. (2022) used Random Forest and XGBoost for Modi, but on VGG16 features and one model at a time.</w:t>
             </w:r>
           </w:p>
           <w:p>
@@ -1794,7 +1769,7 @@
               <w:jc w:val="both"/>
             </w:pPr>
             <w:r>
-              <w:t>To train Random Forest, SVM and XGBoost on these features, compare them on the same test set, and see whether stacking the three beats the best single model. Ekbote et al. (2022) also used Random Forest and XGBoost, but on VGG16 features and one model at a time.</w:t>
+              <w:t>To use SHAP to show which part of a character the model looked at, and to list the pairs of characters it confuses the most. Kolte and Gupta (2025) and Anam and Gupta (2015) both say look-alike characters are the main problem, but neither says which ones.</w:t>
             </w:r>
           </w:p>
           <w:p>
@@ -1807,181 +1782,7 @@
               <w:jc w:val="both"/>
             </w:pPr>
             <w:r>
-              <w:t>To explain every prediction with SHAP, and to find out which character pairs get confused the most and which part of the character causes the confusion. Anam and Gupta (2015) and Kolte and Gupta (2025) both point out that similar looking characters are the main problem, but neither of them lists which ones.</w:t>
-            </w:r>
-          </w:p>
-          <w:p>
-            <w:pPr>
-              <w:numPr>
-                <w:ilvl w:val="0"/>
-                <w:numId w:val="5"/>
-              </w:numPr>
-              <w:spacing w:line="276" w:lineRule="auto"/>
-              <w:jc w:val="both"/>
-            </w:pPr>
-            <w:r>
-              <w:t>To find the training set size at which a plain CNN starts doing better than our classical pipeline. Both are trained on the same splits, from 72 to 2,000 images per class, and tested on the same 11,400 images, so the comparison is fair. Chandankhede et al. (2025) got 97% on test but only 45% on validation with about 21 images per class, which is why we wanted to measure this instead of just assuming deep learning wins.</w:t>
-            </w:r>
-          </w:p>
-          <w:p>
-            <w:pPr>
-              <w:numPr>
-                <w:ilvl w:val="0"/>
-                <w:numId w:val="5"/>
-              </w:numPr>
-              <w:spacing w:line="276" w:lineRule="auto"/>
-              <w:jc w:val="both"/>
-            </w:pPr>
-            <w:r>
-              <w:t>To make a web app that works on both phones and laptops, where you can upload a photo or draw a character and see the predicted character, how confident the model is and why it decided that. It should also split a line of separate characters, since Solanki and Ingle (2019) only worked with single characters.</w:t>
-            </w:r>
-          </w:p>
-          <w:p>
-            <w:pPr>
-              <w:tabs>
-                <w:tab w:val="left" w:pos="2820"/>
-              </w:tabs>
-              <w:spacing w:before="100" w:beforeAutospacing="1" w:after="100" w:afterAutospacing="1"/>
-              <w:jc w:val="both"/>
-              <w:outlineLvl w:val="2"/>
-              <w:rPr>
-                <w:sz w:val="27"/>
-                <w:szCs w:val="27"/>
-                <w:lang w:eastAsia="en-IN"/>
-              </w:rPr>
-            </w:pPr>
-            <w:r>
-              <w:rPr>
-                <w:b/>
-                <w:bCs/>
-                <w:sz w:val="27"/>
-                <w:szCs w:val="27"/>
-                <w:lang w:eastAsia="en-IN"/>
-              </w:rPr>
-              <w:t xml:space="preserve">     </w:t>
-            </w:r>
-            <w:r>
-              <w:rPr>
-                <w:sz w:val="27"/>
-                <w:szCs w:val="27"/>
-                <w:lang w:eastAsia="en-IN"/>
-              </w:rPr>
-              <w:t>Scope</w:t>
-            </w:r>
-          </w:p>
-          <w:p>
-            <w:pPr>
-              <w:numPr>
-                <w:ilvl w:val="0"/>
-                <w:numId w:val="1"/>
-              </w:numPr>
-              <w:spacing w:before="100" w:beforeAutospacing="1" w:after="100" w:afterAutospacing="1" w:line="276" w:lineRule="auto"/>
-              <w:jc w:val="both"/>
-              <w:rPr>
-                <w:lang w:eastAsia="en-IN" w:bidi="mr-IN"/>
-              </w:rPr>
-            </w:pPr>
-            <w:r>
-              <w:rPr>
-                <w:lang w:eastAsia="en-IN" w:bidi="mr-IN"/>
-              </w:rPr>
-              <w:lastRenderedPageBreak/>
-              <w:t>Recognition of 57 isolated handwritten Modi character classes (10 digits, 12 vowels and 35 consonants) from the public MODI-HChar dataset of 575,912 images.</w:t>
-            </w:r>
-          </w:p>
-          <w:p>
-            <w:pPr>
-              <w:numPr>
-                <w:ilvl w:val="0"/>
-                <w:numId w:val="1"/>
-              </w:numPr>
-              <w:spacing w:before="100" w:beforeAutospacing="1" w:after="100" w:afterAutospacing="1" w:line="276" w:lineRule="auto"/>
-              <w:jc w:val="both"/>
-              <w:rPr>
-                <w:lang w:eastAsia="en-IN" w:bidi="mr-IN"/>
-              </w:rPr>
-            </w:pPr>
-            <w:r>
-              <w:rPr>
-                <w:lang w:eastAsia="en-IN" w:bidi="mr-IN"/>
-              </w:rPr>
-              <w:t>Image preprocessing: grayscale conversion, Otsu binarisation, scan-frame and noise removal, and size normalisation.</w:t>
-            </w:r>
-          </w:p>
-          <w:p>
-            <w:pPr>
-              <w:numPr>
-                <w:ilvl w:val="0"/>
-                <w:numId w:val="1"/>
-              </w:numPr>
-              <w:spacing w:before="100" w:beforeAutospacing="1" w:after="100" w:afterAutospacing="1" w:line="276" w:lineRule="auto"/>
-              <w:jc w:val="both"/>
-              <w:rPr>
-                <w:lang w:eastAsia="en-IN" w:bidi="mr-IN"/>
-              </w:rPr>
-            </w:pPr>
-            <w:r>
-              <w:rPr>
-                <w:lang w:eastAsia="en-IN" w:bidi="mr-IN"/>
-              </w:rPr>
-              <w:t>Segmentation of images containing several separated characters into individual characters in reading order.</w:t>
-            </w:r>
-          </w:p>
-          <w:p>
-            <w:pPr>
-              <w:numPr>
-                <w:ilvl w:val="0"/>
-                <w:numId w:val="1"/>
-              </w:numPr>
-              <w:spacing w:before="100" w:beforeAutospacing="1" w:after="100" w:afterAutospacing="1" w:line="276" w:lineRule="auto"/>
-              <w:jc w:val="both"/>
-              <w:rPr>
-                <w:lang w:eastAsia="en-IN" w:bidi="mr-IN"/>
-              </w:rPr>
-            </w:pPr>
-            <w:r>
-              <w:rPr>
-                <w:lang w:eastAsia="en-IN" w:bidi="mr-IN"/>
-              </w:rPr>
-              <w:t>Feature extraction, dimensionality reduction (PCA / LDA), classification and per-class error analysis.</w:t>
-            </w:r>
-          </w:p>
-          <w:p>
-            <w:pPr>
-              <w:numPr>
-                <w:ilvl w:val="0"/>
-                <w:numId w:val="1"/>
-              </w:numPr>
-              <w:spacing w:before="100" w:beforeAutospacing="1" w:after="100" w:afterAutospacing="1" w:line="276" w:lineRule="auto"/>
-              <w:jc w:val="both"/>
-              <w:rPr>
-                <w:lang w:eastAsia="en-IN" w:bidi="mr-IN"/>
-              </w:rPr>
-            </w:pPr>
-            <w:r>
-              <w:rPr>
-                <w:lang w:eastAsia="en-IN" w:bidi="mr-IN"/>
-              </w:rPr>
-              <w:t>Explainable output for every prediction through a web application that works on phones and laptops.</w:t>
-            </w:r>
-          </w:p>
-          <w:p>
-            <w:pPr>
-              <w:numPr>
-                <w:ilvl w:val="0"/>
-                <w:numId w:val="1"/>
-              </w:numPr>
-              <w:spacing w:before="100" w:beforeAutospacing="1" w:after="100" w:afterAutospacing="1" w:line="276" w:lineRule="auto"/>
-              <w:jc w:val="both"/>
-              <w:rPr>
-                <w:lang w:eastAsia="en-IN" w:bidi="mr-IN"/>
-              </w:rPr>
-            </w:pPr>
-            <w:r>
-              <w:rPr>
-                <w:lang w:eastAsia="en-IN" w:bidi="mr-IN"/>
-              </w:rPr>
-              <w:t>Reliable segmentation of continuous cursive manuscripts and full document transliteration are kept as future scope.</w:t>
+              <w:t>To check how a simple CNN does compared to our model when both are trained on the same small amounts of data, starting from 72 images per character. Bhong and Kulkarni (2025) and Chandankhede et al. (2025) got high training accuracy with CNNs but much lower validation accuracy, which made us want to test this ourselves.</w:t>
             </w:r>
           </w:p>
           <w:p>
@@ -2001,6 +1802,7 @@
                 <w:b/>
                 <w:lang w:eastAsia="en-IN"/>
               </w:rPr>
+              <w:lastRenderedPageBreak/>
               <w:t>Methodology</w:t>
             </w:r>
           </w:p>
@@ -2016,7 +1818,7 @@
               <w:rPr>
                 <w:lang w:eastAsia="en-IN" w:bidi="mr-IN"/>
               </w:rPr>
-              <w:t>The methodology follows a reproducible classical machine-learning pipeline with a fixed random seed:</w:t>
+              <w:t>We follow these steps, with a fixed random seed so the results can be repeated:</w:t>
             </w:r>
           </w:p>
           <w:p>
@@ -2052,7 +1854,7 @@
               <w:rPr>
                 <w:lang w:eastAsia="en-IN" w:bidi="mr-IN"/>
               </w:rPr>
-              <w:t>Download the MODI-HDC dataset from Kaggle and count the classes and images from disk instead of relying on published figures.</w:t>
+              <w:t>We use the public MODI-HChar dataset from Kaggle, which has 57 character classes.</w:t>
             </w:r>
           </w:p>
           <w:p>
@@ -2070,7 +1872,7 @@
               <w:rPr>
                 <w:lang w:eastAsia="en-IN" w:bidi="mr-IN"/>
               </w:rPr>
-              <w:t>Create one seeded ordering per class: a fixed test set of 200 images per class and nested training sets of 72 to 2,000 images per class.</w:t>
+              <w:t>For each character, 200 images are kept aside only for testing, and the model is trained on different images.</w:t>
             </w:r>
           </w:p>
           <w:p>
@@ -2106,7 +1908,7 @@
               <w:rPr>
                 <w:lang w:eastAsia="en-IN" w:bidi="mr-IN"/>
               </w:rPr>
-              <w:t>Convert to grayscale, apply median filtering and Otsu binarisation with automatic ink polarity detection.</w:t>
+              <w:t>Each image is converted to grayscale and then to black and white using Otsu thresholding.</w:t>
             </w:r>
           </w:p>
           <w:p>
@@ -2124,7 +1926,7 @@
               <w:rPr>
                 <w:lang w:eastAsia="en-IN" w:bidi="mr-IN"/>
               </w:rPr>
-              <w:t>Remove scan-frame lines and specks, reject blank images, and centre and resize each character to 64 x 64 pixels.</w:t>
+              <w:t>We remove scan borders and small dots, then resize the character to 64 x 64 pixels.</w:t>
             </w:r>
           </w:p>
           <w:p>
@@ -2160,7 +1962,25 @@
               <w:rPr>
                 <w:lang w:eastAsia="en-IN" w:bidi="mr-IN"/>
               </w:rPr>
-              <w:t>Correct skew and find text lines with the horizontal projection profile.</w:t>
+              <w:t>If an image has more than one character, we find the line and cut it where there are gaps between characters.</w:t>
+            </w:r>
+          </w:p>
+          <w:p>
+            <w:pPr>
+              <w:numPr>
+                <w:ilvl w:val="0"/>
+                <w:numId w:val="11"/>
+              </w:numPr>
+              <w:spacing w:before="100" w:beforeAutospacing="1" w:after="100" w:afterAutospacing="1"/>
+              <w:rPr>
+                <w:lang w:eastAsia="en-IN" w:bidi="mr-IN"/>
+              </w:rPr>
+            </w:pPr>
+            <w:r>
+              <w:rPr>
+                <w:lang w:eastAsia="en-IN" w:bidi="mr-IN"/>
+              </w:rPr>
+              <w:t>Feature Extraction</w:t>
             </w:r>
           </w:p>
           <w:p>
@@ -2178,7 +1998,25 @@
               <w:rPr>
                 <w:lang w:eastAsia="en-IN" w:bidi="mr-IN"/>
               </w:rPr>
-              <w:t>Split characters using the vertical projection, headline (shirorekha) handling and connected components, and flag unreliable boxes.</w:t>
+              <w:t>HOG captures the direction of the strokes, and Zernike moments capture the overall shape.</w:t>
+            </w:r>
+          </w:p>
+          <w:p>
+            <w:pPr>
+              <w:numPr>
+                <w:ilvl w:val="1"/>
+                <w:numId w:val="11"/>
+              </w:numPr>
+              <w:spacing w:before="100" w:beforeAutospacing="1" w:after="100" w:afterAutospacing="1"/>
+              <w:rPr>
+                <w:lang w:eastAsia="en-IN" w:bidi="mr-IN"/>
+              </w:rPr>
+            </w:pPr>
+            <w:r>
+              <w:rPr>
+                <w:lang w:eastAsia="en-IN" w:bidi="mr-IN"/>
+              </w:rPr>
+              <w:t>LBP captures small patterns like stroke ends and joints.</w:t>
             </w:r>
           </w:p>
           <w:p>
@@ -2196,7 +2034,7 @@
               <w:rPr>
                 <w:lang w:eastAsia="en-IN" w:bidi="mr-IN"/>
               </w:rPr>
-              <w:t>Feature Extraction</w:t>
+              <w:t>Feature Fusion and Dimensionality Reduction</w:t>
             </w:r>
           </w:p>
           <w:p>
@@ -2214,7 +2052,7 @@
               <w:rPr>
                 <w:lang w:eastAsia="en-IN" w:bidi="mr-IN"/>
               </w:rPr>
-              <w:t>HOG for stroke direction (1,764 features) and Zernike moments for rotation-invariant global shape (49 features).</w:t>
+              <w:t>The three feature sets are joined into one vector of 2,261 values.</w:t>
             </w:r>
           </w:p>
           <w:p>
@@ -2232,7 +2070,7 @@
               <w:rPr>
                 <w:lang w:eastAsia="en-IN" w:bidi="mr-IN"/>
               </w:rPr>
-              <w:t>LBP for local stroke patterns at junctions and stroke ends (448 features).</w:t>
+              <w:t>LDA then reduces this to a much smaller number of features before classification.</w:t>
             </w:r>
           </w:p>
           <w:p>
@@ -2250,7 +2088,7 @@
               <w:rPr>
                 <w:lang w:eastAsia="en-IN" w:bidi="mr-IN"/>
               </w:rPr>
-              <w:t>Feature Fusion and Dimensionality Reduction</w:t>
+              <w:t>Classification</w:t>
             </w:r>
           </w:p>
           <w:p>
@@ -2268,7 +2106,25 @@
               <w:rPr>
                 <w:lang w:eastAsia="en-IN" w:bidi="mr-IN"/>
               </w:rPr>
-              <w:t>Standardise and fuse the three descriptors with family-balanced weighting (2,261 features).</w:t>
+              <w:t>We train Random Forest, SVM and XGBoost, and then a stacking model that combines the three.</w:t>
+            </w:r>
+          </w:p>
+          <w:p>
+            <w:pPr>
+              <w:numPr>
+                <w:ilvl w:val="0"/>
+                <w:numId w:val="11"/>
+              </w:numPr>
+              <w:spacing w:before="100" w:beforeAutospacing="1" w:after="100" w:afterAutospacing="1"/>
+              <w:rPr>
+                <w:lang w:eastAsia="en-IN" w:bidi="mr-IN"/>
+              </w:rPr>
+            </w:pPr>
+            <w:r>
+              <w:rPr>
+                <w:lang w:eastAsia="en-IN" w:bidi="mr-IN"/>
+              </w:rPr>
+              <w:t>Evaluation</w:t>
             </w:r>
           </w:p>
           <w:p>
@@ -2286,7 +2142,25 @@
               <w:rPr>
                 <w:lang w:eastAsia="en-IN" w:bidi="mr-IN"/>
               </w:rPr>
-              <w:t>Compare PCA and LDA using cross-validation on the training data only, and keep the better one (LDA).</w:t>
+              <w:t>We check accuracy, precision, recall and F1 score on the test images, and use the confusion matrix to find which characters get mixed up.</w:t>
+            </w:r>
+          </w:p>
+          <w:p>
+            <w:pPr>
+              <w:numPr>
+                <w:ilvl w:val="1"/>
+                <w:numId w:val="11"/>
+              </w:numPr>
+              <w:spacing w:before="100" w:beforeAutospacing="1" w:after="100" w:afterAutospacing="1"/>
+              <w:rPr>
+                <w:lang w:eastAsia="en-IN" w:bidi="mr-IN"/>
+              </w:rPr>
+            </w:pPr>
+            <w:r>
+              <w:rPr>
+                <w:lang w:eastAsia="en-IN" w:bidi="mr-IN"/>
+              </w:rPr>
+              <w:t>We also train a simple CNN on the same data to compare against.</w:t>
             </w:r>
           </w:p>
           <w:p>
@@ -2304,7 +2178,7 @@
               <w:rPr>
                 <w:lang w:eastAsia="en-IN" w:bidi="mr-IN"/>
               </w:rPr>
-              <w:t>Classification</w:t>
+              <w:t>Explanation and Web App</w:t>
             </w:r>
           </w:p>
           <w:p>
@@ -2322,7 +2196,7 @@
               <w:rPr>
                 <w:lang w:eastAsia="en-IN" w:bidi="mr-IN"/>
               </w:rPr>
-              <w:t>Train Random Forest, SVM (RBF) and XGBoost separately and combine them in a stacking ensemble with a logistic-regression meta-learner.</w:t>
+              <w:t>SHAP shows which parts of the character pushed the model towards its answer.</w:t>
             </w:r>
           </w:p>
           <w:p>
@@ -2340,115 +2214,7 @@
               <w:rPr>
                 <w:lang w:eastAsia="en-IN" w:bidi="mr-IN"/>
               </w:rPr>
-              <w:t>Use stratified splits and cross-validation on the training data only.</w:t>
-            </w:r>
-          </w:p>
-          <w:p>
-            <w:pPr>
-              <w:numPr>
-                <w:ilvl w:val="0"/>
-                <w:numId w:val="11"/>
-              </w:numPr>
-              <w:spacing w:before="100" w:beforeAutospacing="1" w:after="100" w:afterAutospacing="1"/>
-              <w:rPr>
-                <w:lang w:eastAsia="en-IN" w:bidi="mr-IN"/>
-              </w:rPr>
-            </w:pPr>
-            <w:r>
-              <w:rPr>
-                <w:lang w:eastAsia="en-IN" w:bidi="mr-IN"/>
-              </w:rPr>
-              <w:t>Evaluation</w:t>
-            </w:r>
-          </w:p>
-          <w:p>
-            <w:pPr>
-              <w:numPr>
-                <w:ilvl w:val="1"/>
-                <w:numId w:val="11"/>
-              </w:numPr>
-              <w:spacing w:before="100" w:beforeAutospacing="1" w:after="100" w:afterAutospacing="1"/>
-              <w:rPr>
-                <w:lang w:eastAsia="en-IN" w:bidi="mr-IN"/>
-              </w:rPr>
-            </w:pPr>
-            <w:r>
-              <w:rPr>
-                <w:lang w:eastAsia="en-IN" w:bidi="mr-IN"/>
-              </w:rPr>
-              <w:t>Report accuracy, macro precision, recall and F1, per-class and per-category results, the confusion matrix and the most confused character pairs.</w:t>
-            </w:r>
-          </w:p>
-          <w:p>
-            <w:pPr>
-              <w:numPr>
-                <w:ilvl w:val="1"/>
-                <w:numId w:val="11"/>
-              </w:numPr>
-              <w:spacing w:before="100" w:beforeAutospacing="1" w:after="100" w:afterAutospacing="1"/>
-              <w:rPr>
-                <w:lang w:eastAsia="en-IN" w:bidi="mr-IN"/>
-              </w:rPr>
-            </w:pPr>
-            <w:r>
-              <w:rPr>
-                <w:lang w:eastAsia="en-IN" w:bidi="mr-IN"/>
-              </w:rPr>
-              <w:t>Run an ablation of single descriptors against fused features and a learning curve against an untuned reference CNN on identical splits.</w:t>
-            </w:r>
-          </w:p>
-          <w:p>
-            <w:pPr>
-              <w:numPr>
-                <w:ilvl w:val="0"/>
-                <w:numId w:val="11"/>
-              </w:numPr>
-              <w:spacing w:before="100" w:beforeAutospacing="1" w:after="100" w:afterAutospacing="1"/>
-              <w:rPr>
-                <w:lang w:eastAsia="en-IN" w:bidi="mr-IN"/>
-              </w:rPr>
-            </w:pPr>
-            <w:r>
-              <w:rPr>
-                <w:lang w:eastAsia="en-IN" w:bidi="mr-IN"/>
-              </w:rPr>
-              <w:t>Explainability and Deployment</w:t>
-            </w:r>
-          </w:p>
-          <w:p>
-            <w:pPr>
-              <w:numPr>
-                <w:ilvl w:val="1"/>
-                <w:numId w:val="11"/>
-              </w:numPr>
-              <w:spacing w:before="100" w:beforeAutospacing="1" w:after="100" w:afterAutospacing="1"/>
-              <w:rPr>
-                <w:lang w:eastAsia="en-IN" w:bidi="mr-IN"/>
-              </w:rPr>
-            </w:pPr>
-            <w:r>
-              <w:rPr>
-                <w:lang w:eastAsia="en-IN" w:bidi="mr-IN"/>
-              </w:rPr>
-              <w:t>Explain predictions with grouped SHAP: global importance, per-prediction explanations and contrastive explanations for confused pairs.</w:t>
-            </w:r>
-          </w:p>
-          <w:p>
-            <w:pPr>
-              <w:numPr>
-                <w:ilvl w:val="1"/>
-                <w:numId w:val="11"/>
-              </w:numPr>
-              <w:spacing w:before="100" w:beforeAutospacing="1" w:after="100" w:afterAutospacing="1"/>
-              <w:rPr>
-                <w:lang w:eastAsia="en-IN" w:bidi="mr-IN"/>
-              </w:rPr>
-            </w:pPr>
-            <w:r>
-              <w:rPr>
-                <w:lang w:eastAsia="en-IN" w:bidi="mr-IN"/>
-              </w:rPr>
-              <w:t>Deploy a web application with Home, Read, Results, Explain and Script pages.</w:t>
+              <w:t>A small web app lets you upload or draw a character and see the prediction and its explanation.</w:t>
             </w:r>
           </w:p>
           <w:p>
@@ -2814,7 +2580,7 @@
               <w:jc w:val="both"/>
             </w:pPr>
             <w:r>
-              <w:t>The project is designed to have a low environmental footprint. It runs entirely on an ordinary laptop CPU without GPUs, uses classical models that train far faster than deep networks, and caches intermediate results such as processed images and extracted features so that experiments are not recomputed. Digitising and reading archival documents also reduces the need to physically handle fragile paper records, which helps to preserve them.</w:t>
+              <w:t>The project runs on a normal laptop CPU, so it doesn't need a GPU or any cloud server. Classical models train much faster than deep networks, and we save the processed images and features so they don't have to be computed again every time. Reading old documents digitally also means the fragile paper copies get handled less.</w:t>
             </w:r>
           </w:p>
           <w:p>
@@ -2875,7 +2641,7 @@
               <w:rPr>
                 <w:lang w:eastAsia="en-IN"/>
               </w:rPr>
-              <w:t>Sustainability covers both technical sustainability and long-term usefulness of the system.</w:t>
+              <w:t>We tried to keep the project easy to maintain and reuse.</w:t>
             </w:r>
           </w:p>
           <w:p>
@@ -2915,7 +2681,7 @@
               <w:rPr>
                 <w:lang w:eastAsia="en-IN"/>
               </w:rPr>
-              <w:t>Modular - preprocessing, segmentation, feature extraction, models, evaluation and explanation are separate modules that can be improved independently.</w:t>
+              <w:t>Modular: each step (cleaning, features, models, explanations) is a separate file, so one part can be changed without touching the rest.</w:t>
             </w:r>
           </w:p>
           <w:p>
@@ -2935,7 +2701,7 @@
               <w:rPr>
                 <w:lang w:eastAsia="en-IN"/>
               </w:rPr>
-              <w:t>Reproducible - a fixed random seed, pinned library versions and cached results give the same output on every run.</w:t>
+              <w:t>Reproducible: a fixed random seed and fixed library versions give the same results on every run.</w:t>
             </w:r>
           </w:p>
           <w:p>
@@ -2955,7 +2721,7 @@
               <w:rPr>
                 <w:lang w:eastAsia="en-IN"/>
               </w:rPr>
-              <w:t>Configurable - every tunable parameter is kept in one configuration file.</w:t>
+              <w:t>Configurable: all the settings are in one config file.</w:t>
             </w:r>
           </w:p>
           <w:p>
@@ -2975,7 +2741,7 @@
               <w:rPr>
                 <w:lang w:eastAsia="en-IN"/>
               </w:rPr>
-              <w:t>Lightweight - CPU-only training and inference make it usable without specialised hardware.</w:t>
+              <w:t>Lightweight: it runs on a normal laptop without a GPU.</w:t>
             </w:r>
           </w:p>
           <w:p>
@@ -2995,27 +2761,7 @@
               <w:rPr>
                 <w:lang w:eastAsia="en-IN"/>
               </w:rPr>
-              <w:t>Extensible - new descriptors, classifiers, character classes or datasets can be added without redesigning the pipeline.</w:t>
-            </w:r>
-          </w:p>
-          <w:p>
-            <w:pPr>
-              <w:pStyle w:val="ListParagraph"/>
-              <w:numPr>
-                <w:ilvl w:val="0"/>
-                <w:numId w:val="3"/>
-              </w:numPr>
-              <w:spacing w:line="276" w:lineRule="auto"/>
-              <w:jc w:val="both"/>
-              <w:rPr>
-                <w:lang w:eastAsia="en-IN"/>
-              </w:rPr>
-            </w:pPr>
-            <w:r>
-              <w:rPr>
-                <w:lang w:eastAsia="en-IN"/>
-              </w:rPr>
-              <w:t>Tested - automated tests check the data splits, preprocessing, features, segmentation and the web application.</w:t>
+              <w:t>Tested: automatic tests check the main steps and the web app.</w:t>
             </w:r>
           </w:p>
           <w:p>
@@ -3056,7 +2802,7 @@
               <w:jc w:val="both"/>
             </w:pPr>
             <w:r>
-              <w:t>The system is a research prototype that assists human readers of Modi documents; it is not an authoritative transcription service. Its safety measures focus on making uncertainty visible and on secure handling of uploaded images.</w:t>
+              <w:t>This is a student project meant to help someone reading Modi, not to replace them, so the app tries to make it obvious when it is unsure.</w:t>
             </w:r>
           </w:p>
           <w:p>
@@ -3090,7 +2836,7 @@
               <w:jc w:val="both"/>
             </w:pPr>
             <w:r>
-              <w:t>Confidence score for every predicted character with green, amber and red levels.</w:t>
+              <w:t>Every predicted character gets a confidence score shown in green, amber or red.</w:t>
             </w:r>
           </w:p>
           <w:p>
@@ -3104,7 +2850,7 @@
               <w:jc w:val="both"/>
             </w:pPr>
             <w:r>
-              <w:t>Clear flags for unreliable segmentation (merged, fragmented or connected characters).</w:t>
+              <w:t>Characters that may have been cut wrongly are flagged.</w:t>
             </w:r>
           </w:p>
           <w:p>
@@ -3118,7 +2864,7 @@
               <w:jc w:val="both"/>
             </w:pPr>
             <w:r>
-              <w:t>Top-3 alternatives and SHAP explanations so that users can check every decision.</w:t>
+              <w:t>The top 3 guesses and a SHAP explanation are shown so the user can double-check.</w:t>
             </w:r>
           </w:p>
           <w:p>
@@ -3132,7 +2878,7 @@
               <w:jc w:val="both"/>
             </w:pPr>
             <w:r>
-              <w:t>Honest reporting of accuracy limits and failure cases.</w:t>
+              <w:t>We report our accuracy honestly, including where the model fails.</w:t>
             </w:r>
           </w:p>
           <w:p>
@@ -3146,7 +2892,7 @@
               <w:jc w:val="both"/>
             </w:pPr>
             <w:r>
-              <w:t>Human verification of transcriptions before any scholarly or legal use.</w:t>
+              <w:t>Important documents should always be checked by someone who can read Modi.</w:t>
             </w:r>
           </w:p>
           <w:p>
@@ -3180,7 +2926,7 @@
               <w:jc w:val="both"/>
             </w:pPr>
             <w:r>
-              <w:t>Uploaded images are processed locally and are not stored or shared.</w:t>
+              <w:t>Uploaded images are processed on the computer itself and are not saved.</w:t>
             </w:r>
           </w:p>
           <w:p>
@@ -3194,7 +2940,7 @@
               <w:jc w:val="both"/>
             </w:pPr>
             <w:r>
-              <w:t>Validation of uploaded files (type, size and readability) before processing.</w:t>
+              <w:t>The app checks that an uploaded file is really an image and is not too large.</w:t>
             </w:r>
           </w:p>
           <w:p>
@@ -3208,21 +2954,7 @@
               <w:jc w:val="both"/>
             </w:pPr>
             <w:r>
-              <w:t>Upload size limit to prevent misuse of the application.</w:t>
-            </w:r>
-          </w:p>
-          <w:p>
-            <w:pPr>
-              <w:numPr>
-                <w:ilvl w:val="0"/>
-                <w:numId w:val="15"/>
-              </w:numPr>
-              <w:spacing w:before="100" w:beforeAutospacing="1" w:after="100" w:afterAutospacing="1"/>
-              <w:ind w:left="1080"/>
-              <w:jc w:val="both"/>
-            </w:pPr>
-            <w:r>
-              <w:t>Dataset API credentials are kept out of version control.</w:t>
+              <w:t>Our Kaggle login details are kept out of GitHub.</w:t>
             </w:r>
           </w:p>
           <w:p>
@@ -3263,7 +2995,7 @@
               <w:jc w:val="both"/>
             </w:pPr>
             <w:r>
-              <w:t>Modi documents are part of Maharashtra's cultural heritage and may contain land, legal and family records. The project addresses the responsible use of AI for such material through transparency, honest reporting and human oversight.</w:t>
+              <w:t>Modi documents are part of Maharashtra's history and can include land and family records, so we tried to be careful about how the results are presented.</w:t>
             </w:r>
           </w:p>
           <w:p>
@@ -3302,10 +3034,7 @@
                 <w:b w:val="0"/>
                 <w:bCs w:val="0"/>
               </w:rPr>
-              <w:t xml:space="preserve">Transparency: </w:t>
-            </w:r>
-            <w:r>
-              <w:t>Every prediction is accompanied by a SHAP explanation showing which parts of the character influenced the decision.</w:t>
+              <w:t>Transparency: every prediction comes with an explanation of why the model chose it.</w:t>
             </w:r>
           </w:p>
           <w:p>
@@ -3324,10 +3053,7 @@
                 <w:b w:val="0"/>
                 <w:bCs w:val="0"/>
               </w:rPr>
-              <w:t xml:space="preserve">Honest Reporting: </w:t>
-            </w:r>
-            <w:r>
-              <w:t>Results are reported on a fixed public test set, including cases where a method performed worse than expected.</w:t>
+              <w:t>Honest reporting: results are on a public test set, including the cases where our model did worse than expected.</w:t>
             </w:r>
           </w:p>
           <w:p>
@@ -3346,10 +3072,7 @@
                 <w:b w:val="0"/>
                 <w:bCs w:val="0"/>
               </w:rPr>
-              <w:t xml:space="preserve">Data Licensing: </w:t>
-            </w:r>
-            <w:r>
-              <w:t>The MODI-HDC dataset is published under a CC0 public-domain licence.</w:t>
+              <w:t>Data licence: the dataset is public under a CC0 licence.</w:t>
             </w:r>
           </w:p>
           <w:p>
@@ -3368,10 +3091,7 @@
                 <w:b w:val="0"/>
                 <w:bCs w:val="0"/>
               </w:rPr>
-              <w:t xml:space="preserve">Dataset Bias: </w:t>
-            </w:r>
-            <w:r>
-              <w:t>Handwriting from a limited group of writers may not represent every historical period or writing style; this limitation is stated clearly.</w:t>
+              <w:t>Bias: the dataset has a limited number of writers, so the model may not work as well on other handwriting styles.</w:t>
             </w:r>
           </w:p>
           <w:p>
@@ -3390,10 +3110,7 @@
                 <w:b w:val="0"/>
                 <w:bCs w:val="0"/>
               </w:rPr>
-              <w:t xml:space="preserve">Human Oversight: </w:t>
-            </w:r>
-            <w:r>
-              <w:t>Outputs are aids for trained readers and are not treated as authoritative transcriptions.</w:t>
+              <w:t>Human checking: the output is a helper, not a final reading.</w:t>
             </w:r>
           </w:p>
           <w:p>
@@ -3412,10 +3129,7 @@
                 <w:b w:val="0"/>
                 <w:bCs w:val="0"/>
               </w:rPr>
-              <w:t xml:space="preserve">Cultural Respect: </w:t>
-            </w:r>
-            <w:r>
-              <w:t>Character labels and transliterations are checked against reference examples instead of being guessed.</w:t>
+              <w:t>Labels: the Devanagari names of the characters still need to be checked by someone who reads Modi.</w:t>
             </w:r>
           </w:p>
           <w:p>
@@ -3456,7 +3170,7 @@
               <w:jc w:val="both"/>
             </w:pPr>
             <w:r>
-              <w:t>The project has a very low cost because it uses a free public dataset, open-source software and an ordinary laptop; no GPU, paid API or cloud training is required.</w:t>
+              <w:t>The project costs almost nothing. The dataset is free, all the software is open source, and everything runs on a laptop we already have.</w:t>
             </w:r>
           </w:p>
           <w:p>
@@ -3490,7 +3204,7 @@
               <w:jc w:val="both"/>
             </w:pPr>
             <w:r>
-              <w:t>Dataset acquisition: free (public Kaggle dataset, CC0 licence)</w:t>
+              <w:t>Dataset: free (Kaggle, CC0 licence)</w:t>
             </w:r>
           </w:p>
           <w:p>
@@ -3504,7 +3218,7 @@
               <w:jc w:val="both"/>
             </w:pPr>
             <w:r>
-              <w:t>Software and libraries: free and open source</w:t>
+              <w:t>Software: free and open source</w:t>
             </w:r>
           </w:p>
           <w:p>
@@ -3518,7 +3232,7 @@
               <w:jc w:val="both"/>
             </w:pPr>
             <w:r>
-              <w:t>Hardware: existing laptop; no GPU or cloud training needed</w:t>
+              <w:t>Hardware: our own laptop, no GPU</w:t>
             </w:r>
           </w:p>
           <w:p>
@@ -3532,7 +3246,7 @@
               <w:jc w:val="both"/>
             </w:pPr>
             <w:r>
-              <w:t>Development time for implementation, experiments and documentation</w:t>
+              <w:t>Time spent on coding, experiments and writing</w:t>
             </w:r>
           </w:p>
           <w:p>
@@ -3546,21 +3260,7 @@
               <w:jc w:val="both"/>
             </w:pPr>
             <w:r>
-              <w:t>Optional cloud hosting of the web application for demonstration</w:t>
-            </w:r>
-          </w:p>
-          <w:p>
-            <w:pPr>
-              <w:numPr>
-                <w:ilvl w:val="0"/>
-                <w:numId w:val="17"/>
-              </w:numPr>
-              <w:spacing w:before="100" w:beforeAutospacing="1" w:after="100" w:afterAutospacing="1"/>
-              <w:ind w:left="1080"/>
-              <w:jc w:val="both"/>
-            </w:pPr>
-            <w:r>
-              <w:t>Maintenance and retraining on new data</w:t>
+              <w:t>Optional: hosting the web app online for a demo</w:t>
             </w:r>
           </w:p>
           <w:p>
@@ -3602,7 +3302,7 @@
                 <w:sz w:val="24"/>
                 <w:szCs w:val="24"/>
               </w:rPr>
-              <w:t>The system can potentially reduce:</w:t>
+              <w:t>It could help reduce:</w:t>
             </w:r>
           </w:p>
           <w:p>
@@ -3616,7 +3316,7 @@
               <w:jc w:val="both"/>
             </w:pPr>
             <w:r>
-              <w:t>Manual effort and time needed to read archival Modi documents</w:t>
+              <w:t>The time it takes to read Modi documents by hand</w:t>
             </w:r>
           </w:p>
           <w:p>
@@ -3630,7 +3330,7 @@
               <w:jc w:val="both"/>
             </w:pPr>
             <w:r>
-              <w:t>Dependence on the very small number of expert Modi readers</w:t>
+              <w:t>Dependence on the few people who can still read Modi</w:t>
             </w:r>
           </w:p>
           <w:p>
@@ -3644,7 +3344,7 @@
               <w:jc w:val="both"/>
             </w:pPr>
             <w:r>
-              <w:t>Cost of digitising and indexing historical archives</w:t>
+              <w:t>The cost of digitising old archives</w:t>
             </w:r>
           </w:p>
           <w:p>
@@ -3658,7 +3358,7 @@
               <w:jc w:val="both"/>
             </w:pPr>
             <w:r>
-              <w:t>Effort needed by students and researchers to learn the script</w:t>
+              <w:t>The effort needed to learn the script</w:t>
             </w:r>
           </w:p>
           <w:p>
@@ -3731,7 +3431,7 @@
               <w:ind w:left="1080"/>
             </w:pPr>
             <w:r>
-              <w:t>Provides an interactive tool for learning to read Modi characters.</w:t>
+              <w:t>Can be used as a learning aid for reading Modi characters.</w:t>
             </w:r>
           </w:p>
           <w:p>
@@ -3744,20 +3444,7 @@
               <w:ind w:left="1080"/>
             </w:pPr>
             <w:r>
-              <w:t>Explains each prediction, helping learners see how similar characters differ.</w:t>
-            </w:r>
-          </w:p>
-          <w:p>
-            <w:pPr>
-              <w:numPr>
-                <w:ilvl w:val="0"/>
-                <w:numId w:val="21"/>
-              </w:numPr>
-              <w:spacing w:before="100" w:beforeAutospacing="1" w:after="100" w:afterAutospacing="1"/>
-              <w:ind w:left="1080"/>
-            </w:pPr>
-            <w:r>
-              <w:t>Supports students and researchers who work with historical sources.</w:t>
+              <w:t>Shows why the model chose a character, which helps learners see how similar characters differ.</w:t>
             </w:r>
           </w:p>
           <w:p>
@@ -3792,7 +3479,7 @@
               </w:rPr>
             </w:pPr>
             <w:r>
-              <w:t>Applies data science and machine learning to document digitisation.</w:t>
+              <w:t>Uses machine learning for digitising old documents.</w:t>
             </w:r>
           </w:p>
           <w:p>
@@ -3809,24 +3496,7 @@
               </w:rPr>
             </w:pPr>
             <w:r>
-              <w:t>Develops an explainable, CPU-friendly recognition system.</w:t>
-            </w:r>
-          </w:p>
-          <w:p>
-            <w:pPr>
-              <w:numPr>
-                <w:ilvl w:val="0"/>
-                <w:numId w:val="22"/>
-              </w:numPr>
-              <w:spacing w:before="100" w:beforeAutospacing="1" w:after="100" w:afterAutospacing="1"/>
-              <w:ind w:left="1080"/>
-              <w:rPr>
-                <w:b/>
-                <w:bCs/>
-              </w:rPr>
-            </w:pPr>
-            <w:r>
-              <w:t>Contributes an open, reproducible pipeline that others can build on.</w:t>
+              <w:t>Runs on a normal CPU, so it is cheap to use.</w:t>
             </w:r>
           </w:p>
           <w:p>
@@ -3857,7 +3527,7 @@
               <w:ind w:left="1080"/>
             </w:pPr>
             <w:r>
-              <w:t>Helps preserve and give access to Maharashtra's documentary heritage.</w:t>
+              <w:t>Helps keep Maharashtra's old records readable.</w:t>
             </w:r>
           </w:p>
           <w:p>
@@ -3870,20 +3540,7 @@
               <w:ind w:left="1080"/>
             </w:pPr>
             <w:r>
-              <w:t>Supports archives in digitising fragile historical records.</w:t>
-            </w:r>
-          </w:p>
-          <w:p>
-            <w:pPr>
-              <w:numPr>
-                <w:ilvl w:val="0"/>
-                <w:numId w:val="23"/>
-              </w:numPr>
-              <w:spacing w:before="100" w:beforeAutospacing="1" w:after="100" w:afterAutospacing="1"/>
-              <w:ind w:left="1080"/>
-            </w:pPr>
-            <w:r>
-              <w:t>Makes historical land and administrative records easier to read.</w:t>
+              <w:t>Can help archives digitise fragile documents.</w:t>
             </w:r>
           </w:p>
           <w:p>
@@ -3954,10 +3611,7 @@
                 <w:b w:val="0"/>
                 <w:bCs w:val="0"/>
               </w:rPr>
-              <w:t xml:space="preserve">Archive Digitisation: </w:t>
-            </w:r>
-            <w:r>
-              <w:t>Assist archives and libraries in reading and indexing handwritten Modi documents.</w:t>
+              <w:t>Archives: help libraries and archives read and sort Modi documents.</w:t>
             </w:r>
           </w:p>
           <w:p>
@@ -3976,10 +3630,7 @@
                 <w:b w:val="0"/>
                 <w:bCs w:val="0"/>
               </w:rPr>
-              <w:t xml:space="preserve">Historical Research: </w:t>
-            </w:r>
-            <w:r>
-              <w:t>Help historians read land records, court documents and correspondence.</w:t>
+              <w:t>Research: help historians read old land and court records.</w:t>
             </w:r>
           </w:p>
           <w:p>
@@ -3998,10 +3649,7 @@
                 <w:b w:val="0"/>
                 <w:bCs w:val="0"/>
               </w:rPr>
-              <w:t xml:space="preserve">Education: </w:t>
-            </w:r>
-            <w:r>
-              <w:t>Serve as an interactive learning aid for students of the Modi script.</w:t>
+              <w:t>Education: a practice tool for students learning Modi.</w:t>
             </w:r>
           </w:p>
           <w:p>
@@ -4020,32 +3668,7 @@
                 <w:b w:val="0"/>
                 <w:bCs w:val="0"/>
               </w:rPr>
-              <w:t xml:space="preserve">Assisted Transcription: </w:t>
-            </w:r>
-            <w:r>
-              <w:t>Provide character-level suggestions with confidence scores for expert verification.</w:t>
-            </w:r>
-          </w:p>
-          <w:p>
-            <w:pPr>
-              <w:numPr>
-                <w:ilvl w:val="0"/>
-                <w:numId w:val="19"/>
-              </w:numPr>
-              <w:spacing w:before="100" w:beforeAutospacing="1" w:after="100" w:afterAutospacing="1"/>
-              <w:ind w:left="1080"/>
-              <w:jc w:val="both"/>
-            </w:pPr>
-            <w:r>
-              <w:rPr>
-                <w:rStyle w:val="Strong"/>
-                <w:b w:val="0"/>
-                <w:bCs w:val="0"/>
-              </w:rPr>
-              <w:t xml:space="preserve">Explainable AI Demonstration: </w:t>
-            </w:r>
-            <w:r>
-              <w:t>Show how handcrafted features and ensemble models reach their decisions.</w:t>
+              <w:t>Transcription help: suggest characters with confidence scores for an expert to check.</w:t>
             </w:r>
           </w:p>
           <w:p>
@@ -4080,7 +3703,7 @@
               <w:jc w:val="both"/>
             </w:pPr>
             <w:r>
-              <w:t>Reliable segmentation of continuous cursive manuscripts, including touching characters.</w:t>
+              <w:t>Handle joined-up cursive writing, where characters touch each other.</w:t>
             </w:r>
           </w:p>
           <w:p>
@@ -4094,7 +3717,7 @@
               <w:jc w:val="both"/>
             </w:pPr>
             <w:r>
-              <w:t>Word-level and line-level recognition with transliteration into Devanagari.</w:t>
+              <w:t>Read whole words and lines and convert them to Devanagari.</w:t>
             </w:r>
           </w:p>
           <w:p>
@@ -4108,7 +3731,7 @@
               <w:jc w:val="both"/>
             </w:pPr>
             <w:r>
-              <w:t>Recognition of vowel signs (matras) and conjunct characters beyond the 57 base classes.</w:t>
+              <w:t>Add vowel signs (matras) and joint letters.</w:t>
             </w:r>
           </w:p>
           <w:p>
@@ -4122,7 +3745,7 @@
               <w:jc w:val="both"/>
             </w:pPr>
             <w:r>
-              <w:t>Training on more writers and historical eras to improve generalisation.</w:t>
+              <w:t>Train on handwriting from more people and time periods.</w:t>
             </w:r>
           </w:p>
           <w:p>
@@ -4136,7 +3759,7 @@
               <w:jc w:val="both"/>
             </w:pPr>
             <w:r>
-              <w:t>Hybrid models that combine handcrafted features with learned features.</w:t>
+              <w:t>Try combining our features with features learned by a CNN.</w:t>
             </w:r>
           </w:p>
           <w:p>
@@ -4147,15 +3770,6 @@
               </w:numPr>
               <w:spacing w:before="100" w:beforeAutospacing="1" w:after="100" w:afterAutospacing="1"/>
               <w:ind w:left="1080"/>
-              <w:jc w:val="both"/>
-            </w:pPr>
-            <w:r>
-              <w:t>A mobile application for on-site use in archives.</w:t>
-            </w:r>
-          </w:p>
-          <w:p>
-            <w:pPr>
-              <w:ind w:left="360"/>
               <w:jc w:val="both"/>
               <w:rPr>
                 <w:b/>

</xml_diff>

<commit_message>
New project title: Handwritten Modi Character Recognition using Handcrafted Features
Title changed in the synopsis (docx and PDF), README heading, literature review deck and the web app footer. README headline numbers updated to the current results.
</commit_message>
<xml_diff>
--- a/docs/02_synopsis/DS_FF180_g2.docx
+++ b/docs/02_synopsis/DS_FF180_g2.docx
@@ -478,7 +478,7 @@
                 <w:sz w:val="20"/>
                 <w:szCs w:val="20"/>
               </w:rPr>
-              <w:t>Explainable Feature Fusion and Ensemble Learning for Modi Script Recognition</w:t>
+              <w:t>Handwritten Modi Character Recognition using Handcrafted Features</w:t>
             </w:r>
           </w:p>
         </w:tc>
@@ -1802,7 +1802,6 @@
                 <w:b/>
                 <w:lang w:eastAsia="en-IN"/>
               </w:rPr>
-              <w:lastRenderedPageBreak/>
               <w:t>Methodology</w:t>
             </w:r>
           </w:p>
@@ -1908,6 +1907,7 @@
               <w:rPr>
                 <w:lang w:eastAsia="en-IN" w:bidi="mr-IN"/>
               </w:rPr>
+              <w:lastRenderedPageBreak/>
               <w:t>Each image is converted to grayscale and then to black and white using Otsu thresholding.</w:t>
             </w:r>
           </w:p>
@@ -3053,6 +3053,7 @@
                 <w:b w:val="0"/>
                 <w:bCs w:val="0"/>
               </w:rPr>
+              <w:lastRenderedPageBreak/>
               <w:t>Honest reporting: results are on a public test set, including the cases where our model did worse than expected.</w:t>
             </w:r>
           </w:p>
@@ -3514,6 +3515,7 @@
                 <w:sz w:val="24"/>
                 <w:szCs w:val="24"/>
               </w:rPr>
+              <w:lastRenderedPageBreak/>
               <w:t>SDG 11 - Sustainable Cities and Communities (Target 11.4: cultural heritage)</w:t>
             </w:r>
           </w:p>
@@ -4587,6 +4589,7 @@
                 <w:sz w:val="22"/>
                 <w:szCs w:val="22"/>
               </w:rPr>
+              <w:lastRenderedPageBreak/>
               <w:t xml:space="preserve">Signature of Guide: </w:t>
             </w:r>
           </w:p>
@@ -4974,6 +4977,7 @@
                 <w:sz w:val="22"/>
                 <w:szCs w:val="22"/>
               </w:rPr>
+              <w:lastRenderedPageBreak/>
               <w:t xml:space="preserve">Signature of Guide: </w:t>
             </w:r>
           </w:p>

</xml_diff>